<commit_message>
Testfiles included, Program and documentation done.
</commit_message>
<xml_diff>
--- a/Dokumentáció/Dokumentáció.docx
+++ b/Dokumentáció/Dokumentáció.docx
@@ -883,7 +883,7 @@
           <w:color w:val="000000" w:themeColor="text1"/>
           <w:lang w:val="hu-HU"/>
         </w:rPr>
-        <w:t>txt-ből</w:t>
+        <w:t>txt</w:t>
       </w:r>
       <w:proofErr w:type="spellEnd"/>
       <w:r>
@@ -892,7 +892,7 @@
           <w:color w:val="000000" w:themeColor="text1"/>
           <w:lang w:val="hu-HU"/>
         </w:rPr>
-        <w:t xml:space="preserve"> a térkép gráfját és eltárolja, amikor hozzáadunk új utakat azzal kibővíti ezt a listát és a program bezárásakor elmenti az új vagy megmaradt listát a </w:t>
+        <w:t xml:space="preserve">-ből a térkép gráfját és eltárolja, amikor hozzáadunk új utakat azzal kibővíti ezt a listát és a program bezárásakor elmenti az új vagy megmaradt listát a </w:t>
       </w:r>
       <w:proofErr w:type="spellStart"/>
       <w:r>
@@ -1116,25 +1116,7 @@
           <w:color w:val="000000" w:themeColor="text1"/>
           <w:lang w:val="hu-HU"/>
         </w:rPr>
-        <w:t>(pl.: Leggyorsabb útvonal x-</w:t>
-      </w:r>
-      <w:proofErr w:type="spellStart"/>
-      <w:r>
-        <w:rPr>
-          <w:rFonts w:ascii="Arial" w:hAnsi="Arial" w:cs="Arial"/>
-          <w:color w:val="000000" w:themeColor="text1"/>
-          <w:lang w:val="hu-HU"/>
-        </w:rPr>
-        <w:t>ből</w:t>
-      </w:r>
-      <w:proofErr w:type="spellEnd"/>
-      <w:r>
-        <w:rPr>
-          <w:rFonts w:ascii="Arial" w:hAnsi="Arial" w:cs="Arial"/>
-          <w:color w:val="000000" w:themeColor="text1"/>
-          <w:lang w:val="hu-HU"/>
-        </w:rPr>
-        <w:t xml:space="preserve"> y-</w:t>
+        <w:t>(pl.: Leggyorsabb útvonal x-ből y-</w:t>
       </w:r>
       <w:proofErr w:type="spellStart"/>
       <w:r>
@@ -1417,21 +1399,24 @@
     </w:p>
     <w:p>
       <w:pPr>
-        <w:rPr>
-          <w:rFonts w:ascii="Arial" w:hAnsi="Arial" w:cs="Arial"/>
-          <w:color w:val="000000" w:themeColor="text1"/>
-          <w:lang w:val="hu-HU"/>
-        </w:rPr>
-      </w:pPr>
-      <w:r>
-        <w:rPr>
-          <w:rFonts w:ascii="Arial" w:hAnsi="Arial" w:cs="Arial"/>
-          <w:noProof/>
-          <w:color w:val="000000" w:themeColor="text1"/>
-          <w:lang w:val="hu-HU"/>
-        </w:rPr>
+        <w:pageBreakBefore/>
+        <w:rPr>
+          <w:rFonts w:ascii="Arial" w:hAnsi="Arial" w:cs="Arial"/>
+          <w:color w:val="C00000"/>
+          <w:lang w:val="hu-HU"/>
+        </w:rPr>
+      </w:pPr>
+      <w:r>
+        <w:rPr>
+          <w:rFonts w:ascii="Arial" w:hAnsi="Arial" w:cs="Arial"/>
+          <w:color w:val="800000"/>
+          <w:sz w:val="32"/>
+          <w:szCs w:val="32"/>
+          <w:lang w:val="hu-HU"/>
+        </w:rPr>
+        <w:lastRenderedPageBreak/>
         <w:drawing>
-          <wp:anchor distT="0" distB="0" distL="114300" distR="114300" simplePos="0" relativeHeight="251658240" behindDoc="1" locked="0" layoutInCell="1" allowOverlap="1" wp14:anchorId="30AA154F" wp14:editId="5FEDF72A">
+          <wp:anchor distT="0" distB="0" distL="114300" distR="114300" simplePos="0" relativeHeight="251658240" behindDoc="1" locked="0" layoutInCell="1" allowOverlap="1" wp14:anchorId="30AA154F" wp14:editId="3EFC8584">
             <wp:simplePos x="0" y="0"/>
             <wp:positionH relativeFrom="column">
               <wp:posOffset>-913766</wp:posOffset>
@@ -1504,7 +1489,347 @@
         </w:rPr>
         <w:t>Terv:</w:t>
       </w:r>
-      <w:r>
+    </w:p>
+    <w:p>
+      <w:pPr>
+        <w:pStyle w:val="ListParagraph"/>
+        <w:widowControl w:val="0"/>
+        <w:numPr>
+          <w:ilvl w:val="0"/>
+          <w:numId w:val="1"/>
+        </w:numPr>
+        <w:ind w:left="714" w:hanging="357"/>
+        <w:rPr>
+          <w:rFonts w:ascii="Arial" w:hAnsi="Arial" w:cs="Arial"/>
+          <w:color w:val="000000" w:themeColor="text1"/>
+          <w:lang w:val="hu-HU"/>
+        </w:rPr>
+      </w:pPr>
+      <w:r>
+        <w:rPr>
+          <w:rFonts w:ascii="Arial" w:hAnsi="Arial" w:cs="Arial"/>
+          <w:color w:val="000000" w:themeColor="text1"/>
+          <w:lang w:val="hu-HU"/>
+        </w:rPr>
+        <w:t xml:space="preserve">A program egy main programban kezdődik, ami létrehoz egy </w:t>
+      </w:r>
+      <w:proofErr w:type="spellStart"/>
+      <w:r>
+        <w:rPr>
+          <w:rFonts w:ascii="Arial" w:hAnsi="Arial" w:cs="Arial"/>
+          <w:color w:val="000000" w:themeColor="text1"/>
+          <w:lang w:val="hu-HU"/>
+        </w:rPr>
+        <w:t>plannert</w:t>
+      </w:r>
+      <w:proofErr w:type="spellEnd"/>
+      <w:r>
+        <w:rPr>
+          <w:rFonts w:ascii="Arial" w:hAnsi="Arial" w:cs="Arial"/>
+          <w:color w:val="000000" w:themeColor="text1"/>
+          <w:lang w:val="hu-HU"/>
+        </w:rPr>
+        <w:t xml:space="preserve"> és benne fut a menü egy </w:t>
+      </w:r>
+      <w:proofErr w:type="spellStart"/>
+      <w:r>
+        <w:rPr>
+          <w:rFonts w:ascii="Arial" w:hAnsi="Arial" w:cs="Arial"/>
+          <w:color w:val="000000" w:themeColor="text1"/>
+          <w:lang w:val="hu-HU"/>
+        </w:rPr>
+        <w:t>while</w:t>
+      </w:r>
+      <w:proofErr w:type="spellEnd"/>
+      <w:r>
+        <w:rPr>
+          <w:rFonts w:ascii="Arial" w:hAnsi="Arial" w:cs="Arial"/>
+          <w:color w:val="000000" w:themeColor="text1"/>
+          <w:lang w:val="hu-HU"/>
+        </w:rPr>
+        <w:t xml:space="preserve"> ciklusban. Innen tudja a felhasználó input megadásával belépni a program funkciójába.</w:t>
+      </w:r>
+    </w:p>
+    <w:p>
+      <w:pPr>
+        <w:pStyle w:val="ListParagraph"/>
+        <w:widowControl w:val="0"/>
+        <w:numPr>
+          <w:ilvl w:val="0"/>
+          <w:numId w:val="1"/>
+        </w:numPr>
+        <w:rPr>
+          <w:rFonts w:ascii="Arial" w:hAnsi="Arial" w:cs="Arial"/>
+          <w:color w:val="000000" w:themeColor="text1"/>
+          <w:lang w:val="hu-HU"/>
+        </w:rPr>
+      </w:pPr>
+      <w:r>
+        <w:rPr>
+          <w:rFonts w:ascii="Arial" w:hAnsi="Arial" w:cs="Arial"/>
+          <w:color w:val="000000" w:themeColor="text1"/>
+          <w:lang w:val="hu-HU"/>
+        </w:rPr>
+        <w:t xml:space="preserve">A program a </w:t>
+      </w:r>
+      <w:proofErr w:type="spellStart"/>
+      <w:proofErr w:type="gramStart"/>
+      <w:r>
+        <w:rPr>
+          <w:rFonts w:ascii="Arial" w:hAnsi="Arial" w:cs="Arial"/>
+          <w:color w:val="000000" w:themeColor="text1"/>
+          <w:lang w:val="hu-HU"/>
+        </w:rPr>
+        <w:t>Graph</w:t>
+      </w:r>
+      <w:proofErr w:type="spellEnd"/>
+      <w:r>
+        <w:rPr>
+          <w:rFonts w:ascii="Arial" w:hAnsi="Arial" w:cs="Arial"/>
+          <w:color w:val="000000" w:themeColor="text1"/>
+          <w:lang w:val="hu-HU"/>
+        </w:rPr>
+        <w:t>::</w:t>
+      </w:r>
+      <w:proofErr w:type="spellStart"/>
+      <w:r>
+        <w:rPr>
+          <w:rFonts w:ascii="Arial" w:hAnsi="Arial" w:cs="Arial"/>
+          <w:color w:val="000000" w:themeColor="text1"/>
+          <w:lang w:val="hu-HU"/>
+        </w:rPr>
+        <w:t>findPathI</w:t>
+      </w:r>
+      <w:proofErr w:type="spellEnd"/>
+      <w:r>
+        <w:rPr>
+          <w:rFonts w:ascii="Arial" w:hAnsi="Arial" w:cs="Arial"/>
+          <w:color w:val="000000" w:themeColor="text1"/>
+          <w:lang w:val="hu-HU"/>
+        </w:rPr>
+        <w:t>(</w:t>
+      </w:r>
+      <w:proofErr w:type="gramEnd"/>
+      <w:r>
+        <w:rPr>
+          <w:rFonts w:ascii="Arial" w:hAnsi="Arial" w:cs="Arial"/>
+          <w:color w:val="000000" w:themeColor="text1"/>
+          <w:lang w:val="hu-HU"/>
+        </w:rPr>
+        <w:t xml:space="preserve">) függvényben egy Dijkstra algoritmussal keresi a legrövidebb utat a megadott két pont között. </w:t>
+      </w:r>
+    </w:p>
+    <w:p>
+      <w:pPr>
+        <w:pStyle w:val="ListParagraph"/>
+        <w:widowControl w:val="0"/>
+        <w:numPr>
+          <w:ilvl w:val="1"/>
+          <w:numId w:val="1"/>
+        </w:numPr>
+        <w:rPr>
+          <w:rFonts w:ascii="Arial" w:hAnsi="Arial" w:cs="Arial"/>
+          <w:color w:val="000000" w:themeColor="text1"/>
+          <w:lang w:val="hu-HU"/>
+        </w:rPr>
+      </w:pPr>
+      <w:r>
+        <w:rPr>
+          <w:rFonts w:ascii="Arial" w:hAnsi="Arial" w:cs="Arial"/>
+          <w:color w:val="000000" w:themeColor="text1"/>
+          <w:lang w:val="hu-HU"/>
+        </w:rPr>
+        <w:t>Bemenet: két pont.</w:t>
+      </w:r>
+    </w:p>
+    <w:p>
+      <w:pPr>
+        <w:pStyle w:val="ListParagraph"/>
+        <w:widowControl w:val="0"/>
+        <w:numPr>
+          <w:ilvl w:val="1"/>
+          <w:numId w:val="1"/>
+        </w:numPr>
+        <w:rPr>
+          <w:rFonts w:ascii="Arial" w:hAnsi="Arial" w:cs="Arial"/>
+          <w:color w:val="000000" w:themeColor="text1"/>
+          <w:lang w:val="hu-HU"/>
+        </w:rPr>
+      </w:pPr>
+      <w:r>
+        <w:rPr>
+          <w:rFonts w:ascii="Arial" w:hAnsi="Arial" w:cs="Arial"/>
+          <w:color w:val="000000" w:themeColor="text1"/>
+          <w:lang w:val="hu-HU"/>
+        </w:rPr>
+        <w:t>Minden ponthoz végtelen távolságot rendelünk kivéve a kezdőponthoz, ami 0 lesz.</w:t>
+      </w:r>
+    </w:p>
+    <w:p>
+      <w:pPr>
+        <w:pStyle w:val="ListParagraph"/>
+        <w:widowControl w:val="0"/>
+        <w:numPr>
+          <w:ilvl w:val="1"/>
+          <w:numId w:val="1"/>
+        </w:numPr>
+        <w:rPr>
+          <w:rFonts w:ascii="Arial" w:hAnsi="Arial" w:cs="Arial"/>
+          <w:color w:val="000000" w:themeColor="text1"/>
+          <w:lang w:val="hu-HU"/>
+        </w:rPr>
+      </w:pPr>
+      <w:r>
+        <w:rPr>
+          <w:rFonts w:ascii="Arial" w:hAnsi="Arial" w:cs="Arial"/>
+          <w:color w:val="000000" w:themeColor="text1"/>
+          <w:lang w:val="hu-HU"/>
+        </w:rPr>
+        <w:t>Az összes többi pont meglátogatatlannak jelöli a program.</w:t>
+      </w:r>
+    </w:p>
+    <w:p>
+      <w:pPr>
+        <w:pStyle w:val="ListParagraph"/>
+        <w:widowControl w:val="0"/>
+        <w:numPr>
+          <w:ilvl w:val="1"/>
+          <w:numId w:val="1"/>
+        </w:numPr>
+        <w:rPr>
+          <w:rFonts w:ascii="Arial" w:hAnsi="Arial" w:cs="Arial"/>
+          <w:color w:val="000000" w:themeColor="text1"/>
+          <w:lang w:val="hu-HU"/>
+        </w:rPr>
+      </w:pPr>
+      <w:r>
+        <w:rPr>
+          <w:rFonts w:ascii="Arial" w:hAnsi="Arial" w:cs="Arial"/>
+          <w:color w:val="000000" w:themeColor="text1"/>
+          <w:lang w:val="hu-HU"/>
+        </w:rPr>
+        <w:t>A kezdőpontból elérhető pontok közül kiválasztja a legközelebbit.</w:t>
+      </w:r>
+    </w:p>
+    <w:p>
+      <w:pPr>
+        <w:pStyle w:val="ListParagraph"/>
+        <w:widowControl w:val="0"/>
+        <w:numPr>
+          <w:ilvl w:val="2"/>
+          <w:numId w:val="1"/>
+        </w:numPr>
+        <w:rPr>
+          <w:rFonts w:ascii="Arial" w:hAnsi="Arial" w:cs="Arial"/>
+          <w:color w:val="000000" w:themeColor="text1"/>
+          <w:lang w:val="hu-HU"/>
+        </w:rPr>
+      </w:pPr>
+      <w:r>
+        <w:rPr>
+          <w:rFonts w:ascii="Arial" w:hAnsi="Arial" w:cs="Arial"/>
+          <w:color w:val="000000" w:themeColor="text1"/>
+          <w:lang w:val="hu-HU"/>
+        </w:rPr>
+        <w:t>Megnézi az összes szomszédját milyen távol van és kiszámolja a távolságot odáig a kezdőpontból.</w:t>
+      </w:r>
+    </w:p>
+    <w:p>
+      <w:pPr>
+        <w:pStyle w:val="ListParagraph"/>
+        <w:widowControl w:val="0"/>
+        <w:numPr>
+          <w:ilvl w:val="2"/>
+          <w:numId w:val="1"/>
+        </w:numPr>
+        <w:rPr>
+          <w:rFonts w:ascii="Arial" w:hAnsi="Arial" w:cs="Arial"/>
+          <w:color w:val="000000" w:themeColor="text1"/>
+          <w:lang w:val="hu-HU"/>
+        </w:rPr>
+      </w:pPr>
+      <w:r>
+        <w:rPr>
+          <w:rFonts w:ascii="Arial" w:hAnsi="Arial" w:cs="Arial"/>
+          <w:color w:val="000000" w:themeColor="text1"/>
+          <w:lang w:val="hu-HU"/>
+        </w:rPr>
+        <w:t xml:space="preserve">Ha ez a táv kisebb, mint az eddig abba a pontba menő táv akkor átírjuk. </w:t>
+      </w:r>
+    </w:p>
+    <w:p>
+      <w:pPr>
+        <w:pStyle w:val="ListParagraph"/>
+        <w:widowControl w:val="0"/>
+        <w:numPr>
+          <w:ilvl w:val="1"/>
+          <w:numId w:val="1"/>
+        </w:numPr>
+        <w:rPr>
+          <w:rFonts w:ascii="Arial" w:hAnsi="Arial" w:cs="Arial"/>
+          <w:color w:val="000000" w:themeColor="text1"/>
+          <w:lang w:val="hu-HU"/>
+        </w:rPr>
+      </w:pPr>
+      <w:r>
+        <w:rPr>
+          <w:rFonts w:ascii="Arial" w:hAnsi="Arial" w:cs="Arial"/>
+          <w:color w:val="000000" w:themeColor="text1"/>
+          <w:lang w:val="hu-HU"/>
+        </w:rPr>
+        <w:t>Megjelöljük az előbb vizsgált pontot (amiből jött a következő) meglátogatottnak</w:t>
+      </w:r>
+    </w:p>
+    <w:p>
+      <w:pPr>
+        <w:pStyle w:val="ListParagraph"/>
+        <w:widowControl w:val="0"/>
+        <w:numPr>
+          <w:ilvl w:val="1"/>
+          <w:numId w:val="1"/>
+        </w:numPr>
+        <w:rPr>
+          <w:rFonts w:ascii="Arial" w:hAnsi="Arial" w:cs="Arial"/>
+          <w:color w:val="000000" w:themeColor="text1"/>
+          <w:lang w:val="hu-HU"/>
+        </w:rPr>
+      </w:pPr>
+      <w:r>
+        <w:rPr>
+          <w:rFonts w:ascii="Arial" w:hAnsi="Arial" w:cs="Arial"/>
+          <w:color w:val="000000" w:themeColor="text1"/>
+          <w:lang w:val="hu-HU"/>
+        </w:rPr>
+        <w:t>Ezt addig ismételjük amíg el nem érjük a célpontot vagy el nem fogynak a meglátogatható pontok</w:t>
+      </w:r>
+    </w:p>
+    <w:p>
+      <w:pPr>
+        <w:pStyle w:val="ListParagraph"/>
+        <w:widowControl w:val="0"/>
+        <w:numPr>
+          <w:ilvl w:val="1"/>
+          <w:numId w:val="1"/>
+        </w:numPr>
+        <w:rPr>
+          <w:rFonts w:ascii="Arial" w:hAnsi="Arial" w:cs="Arial"/>
+          <w:color w:val="000000" w:themeColor="text1"/>
+          <w:lang w:val="hu-HU"/>
+        </w:rPr>
+      </w:pPr>
+      <w:r>
+        <w:rPr>
+          <w:rFonts w:ascii="Arial" w:hAnsi="Arial" w:cs="Arial"/>
+          <w:color w:val="000000" w:themeColor="text1"/>
+          <w:lang w:val="hu-HU"/>
+        </w:rPr>
+        <w:t>Kimenet: Tömb a pontokból, amin végig kell menni.</w:t>
+      </w:r>
+    </w:p>
+    <w:p>
+      <w:pPr>
+        <w:pageBreakBefore/>
+        <w:widowControl w:val="0"/>
         <w:rPr>
           <w:rFonts w:ascii="Arial" w:hAnsi="Arial" w:cs="Arial"/>
           <w:color w:val="800000"/>
@@ -1512,13 +1837,1309 @@
           <w:szCs w:val="32"/>
           <w:lang w:val="hu-HU"/>
         </w:rPr>
-        <w:t xml:space="preserve">                   </w:t>
-      </w:r>
-    </w:p>
-    <w:p>
-      <w:pPr>
-        <w:pStyle w:val="ListParagraph"/>
+      </w:pPr>
+      <w:r>
+        <w:rPr>
+          <w:rFonts w:ascii="Arial" w:hAnsi="Arial" w:cs="Arial"/>
+          <w:color w:val="800000"/>
+          <w:sz w:val="32"/>
+          <w:szCs w:val="32"/>
+          <w:lang w:val="hu-HU"/>
+        </w:rPr>
+        <w:lastRenderedPageBreak/>
+        <w:t>Fejlesztői dokumentáció:</w:t>
+      </w:r>
+    </w:p>
+    <w:p>
+      <w:pPr>
+        <w:pStyle w:val="ListParagraph"/>
+        <w:widowControl w:val="0"/>
+        <w:numPr>
+          <w:ilvl w:val="0"/>
+          <w:numId w:val="1"/>
+        </w:numPr>
+        <w:rPr>
+          <w:rFonts w:ascii="Arial" w:hAnsi="Arial" w:cs="Arial"/>
+          <w:color w:val="000000" w:themeColor="text1"/>
+          <w:lang w:val="hu-HU"/>
+        </w:rPr>
+      </w:pPr>
+      <w:r>
+        <w:rPr>
+          <w:rFonts w:ascii="Arial" w:hAnsi="Arial" w:cs="Arial"/>
+          <w:color w:val="000000" w:themeColor="text1"/>
+          <w:lang w:val="hu-HU"/>
+        </w:rPr>
+        <w:t>Felépítés:</w:t>
+      </w:r>
+    </w:p>
+    <w:p>
+      <w:pPr>
+        <w:pStyle w:val="ListParagraph"/>
+        <w:widowControl w:val="0"/>
+        <w:rPr>
+          <w:rFonts w:ascii="Arial" w:hAnsi="Arial" w:cs="Arial"/>
+          <w:color w:val="000000" w:themeColor="text1"/>
+          <w:lang w:val="hu-HU"/>
+        </w:rPr>
+      </w:pPr>
+      <w:r>
+        <w:rPr>
+          <w:rFonts w:ascii="Arial" w:hAnsi="Arial" w:cs="Arial"/>
+          <w:color w:val="000000" w:themeColor="text1"/>
+          <w:lang w:val="hu-HU"/>
+        </w:rPr>
+        <w:t xml:space="preserve">A program több fő file-ból épül fel. Az egész a main-ből indul, ami létrehoz egy Planner osztályt. Ez az osztály felel az összes fontos feladatért, amit a program csinál. Benne van a </w:t>
+      </w:r>
+      <w:r>
+        <w:rPr>
+          <w:rFonts w:ascii="Arial" w:hAnsi="Arial" w:cs="Arial"/>
+          <w:color w:val="000000" w:themeColor="text1"/>
+          <w:lang w:val="hu-HU"/>
+        </w:rPr>
+        <w:t>gráf,</w:t>
+      </w:r>
+      <w:r>
+        <w:rPr>
+          <w:rFonts w:ascii="Arial" w:hAnsi="Arial" w:cs="Arial"/>
+          <w:color w:val="000000" w:themeColor="text1"/>
+          <w:lang w:val="hu-HU"/>
+        </w:rPr>
+        <w:t xml:space="preserve"> amin tervezi az útvonalat és </w:t>
+      </w:r>
+      <w:r>
+        <w:rPr>
+          <w:rFonts w:ascii="Arial" w:hAnsi="Arial" w:cs="Arial"/>
+          <w:color w:val="000000" w:themeColor="text1"/>
+          <w:lang w:val="hu-HU"/>
+        </w:rPr>
+        <w:t>ő</w:t>
+      </w:r>
+      <w:r>
+        <w:rPr>
+          <w:rFonts w:ascii="Arial" w:hAnsi="Arial" w:cs="Arial"/>
+          <w:color w:val="000000" w:themeColor="text1"/>
+          <w:lang w:val="hu-HU"/>
+        </w:rPr>
+        <w:t xml:space="preserve"> olvassa be és írja ki az adat file-t.</w:t>
+      </w:r>
+    </w:p>
+    <w:p>
+      <w:pPr>
+        <w:pStyle w:val="ListParagraph"/>
+        <w:widowControl w:val="0"/>
+        <w:numPr>
+          <w:ilvl w:val="0"/>
+          <w:numId w:val="1"/>
+        </w:numPr>
+        <w:rPr>
+          <w:rFonts w:ascii="Arial" w:hAnsi="Arial" w:cs="Arial"/>
+          <w:color w:val="000000" w:themeColor="text1"/>
+          <w:lang w:val="hu-HU"/>
+        </w:rPr>
+      </w:pPr>
+      <w:r>
+        <w:rPr>
+          <w:rFonts w:ascii="Arial" w:hAnsi="Arial" w:cs="Arial"/>
+          <w:color w:val="000000" w:themeColor="text1"/>
+          <w:lang w:val="hu-HU"/>
+        </w:rPr>
+        <w:t>Gráf:</w:t>
+      </w:r>
+    </w:p>
+    <w:p>
+      <w:pPr>
+        <w:pStyle w:val="ListParagraph"/>
+        <w:widowControl w:val="0"/>
+        <w:rPr>
+          <w:rFonts w:ascii="Arial" w:hAnsi="Arial" w:cs="Arial"/>
+          <w:color w:val="000000" w:themeColor="text1"/>
+          <w:lang w:val="hu-HU"/>
+        </w:rPr>
+      </w:pPr>
+      <w:r>
+        <w:rPr>
+          <w:rFonts w:ascii="Arial" w:hAnsi="Arial" w:cs="Arial"/>
+          <w:color w:val="000000" w:themeColor="text1"/>
+          <w:lang w:val="hu-HU"/>
+        </w:rPr>
+        <w:t xml:space="preserve">A gráf egy vektorban tárolt </w:t>
+      </w:r>
+      <w:proofErr w:type="spellStart"/>
+      <w:r>
+        <w:rPr>
+          <w:rFonts w:ascii="Arial" w:hAnsi="Arial" w:cs="Arial"/>
+          <w:color w:val="000000" w:themeColor="text1"/>
+          <w:lang w:val="hu-HU"/>
+        </w:rPr>
+        <w:t>Node</w:t>
+      </w:r>
+      <w:proofErr w:type="spellEnd"/>
+      <w:r>
+        <w:rPr>
+          <w:rFonts w:ascii="Arial" w:hAnsi="Arial" w:cs="Arial"/>
+          <w:color w:val="000000" w:themeColor="text1"/>
+          <w:lang w:val="hu-HU"/>
+        </w:rPr>
+        <w:t>- és Edge-</w:t>
+      </w:r>
+      <w:proofErr w:type="spellStart"/>
+      <w:r>
+        <w:rPr>
+          <w:rFonts w:ascii="Arial" w:hAnsi="Arial" w:cs="Arial"/>
+          <w:color w:val="000000" w:themeColor="text1"/>
+          <w:lang w:val="hu-HU"/>
+        </w:rPr>
+        <w:t>eket</w:t>
+      </w:r>
+      <w:proofErr w:type="spellEnd"/>
+      <w:r>
+        <w:rPr>
+          <w:rFonts w:ascii="Arial" w:hAnsi="Arial" w:cs="Arial"/>
+          <w:color w:val="000000" w:themeColor="text1"/>
+          <w:lang w:val="hu-HU"/>
+        </w:rPr>
+        <w:t xml:space="preserve"> tárol. Az </w:t>
+      </w:r>
+      <w:proofErr w:type="spellStart"/>
+      <w:r>
+        <w:rPr>
+          <w:rFonts w:ascii="Arial" w:hAnsi="Arial" w:cs="Arial"/>
+          <w:color w:val="000000" w:themeColor="text1"/>
+          <w:lang w:val="hu-HU"/>
+        </w:rPr>
+        <w:t>edgek</w:t>
+      </w:r>
+      <w:proofErr w:type="spellEnd"/>
+      <w:r>
+        <w:rPr>
+          <w:rFonts w:ascii="Arial" w:hAnsi="Arial" w:cs="Arial"/>
+          <w:color w:val="000000" w:themeColor="text1"/>
+          <w:lang w:val="hu-HU"/>
+        </w:rPr>
+        <w:t xml:space="preserve"> két </w:t>
+      </w:r>
+      <w:proofErr w:type="spellStart"/>
+      <w:r>
+        <w:rPr>
+          <w:rFonts w:ascii="Arial" w:hAnsi="Arial" w:cs="Arial"/>
+          <w:color w:val="000000" w:themeColor="text1"/>
+          <w:lang w:val="hu-HU"/>
+        </w:rPr>
+        <w:t>node-oz</w:t>
+      </w:r>
+      <w:proofErr w:type="spellEnd"/>
+      <w:r>
+        <w:rPr>
+          <w:rFonts w:ascii="Arial" w:hAnsi="Arial" w:cs="Arial"/>
+          <w:color w:val="000000" w:themeColor="text1"/>
+          <w:lang w:val="hu-HU"/>
+        </w:rPr>
+        <w:t xml:space="preserve"> kötnek össze. </w:t>
+      </w:r>
+    </w:p>
+    <w:p>
+      <w:pPr>
+        <w:pStyle w:val="ListParagraph"/>
+        <w:widowControl w:val="0"/>
+        <w:numPr>
+          <w:ilvl w:val="1"/>
+          <w:numId w:val="1"/>
+        </w:numPr>
+        <w:rPr>
+          <w:rFonts w:ascii="Arial" w:hAnsi="Arial" w:cs="Arial"/>
+          <w:color w:val="000000" w:themeColor="text1"/>
+          <w:lang w:val="hu-HU"/>
+        </w:rPr>
+      </w:pPr>
+      <w:r>
+        <w:rPr>
+          <w:rFonts w:ascii="Arial" w:hAnsi="Arial" w:cs="Arial"/>
+          <w:color w:val="000000" w:themeColor="text1"/>
+          <w:lang w:val="hu-HU"/>
+        </w:rPr>
+        <w:t xml:space="preserve">Edge: Van egy Id-je, neve, hossza, és tartalmazza a két vége </w:t>
+      </w:r>
+      <w:proofErr w:type="spellStart"/>
+      <w:r>
+        <w:rPr>
+          <w:rFonts w:ascii="Arial" w:hAnsi="Arial" w:cs="Arial"/>
+          <w:color w:val="000000" w:themeColor="text1"/>
+          <w:lang w:val="hu-HU"/>
+        </w:rPr>
+        <w:t>Node</w:t>
+      </w:r>
+      <w:proofErr w:type="spellEnd"/>
+      <w:r>
+        <w:rPr>
+          <w:rFonts w:ascii="Arial" w:hAnsi="Arial" w:cs="Arial"/>
+          <w:color w:val="000000" w:themeColor="text1"/>
+          <w:lang w:val="hu-HU"/>
+        </w:rPr>
+        <w:t>-ot. Fő függvényei visszaadják az elemeit. Van egy ostream operátora is.</w:t>
+      </w:r>
+    </w:p>
+    <w:p>
+      <w:pPr>
+        <w:pStyle w:val="ListParagraph"/>
+        <w:widowControl w:val="0"/>
+        <w:numPr>
+          <w:ilvl w:val="1"/>
+          <w:numId w:val="1"/>
+        </w:numPr>
+        <w:rPr>
+          <w:rFonts w:ascii="Arial" w:hAnsi="Arial" w:cs="Arial"/>
+          <w:color w:val="000000" w:themeColor="text1"/>
+          <w:lang w:val="hu-HU"/>
+        </w:rPr>
+      </w:pPr>
+      <w:proofErr w:type="spellStart"/>
+      <w:r>
+        <w:rPr>
+          <w:rFonts w:ascii="Arial" w:hAnsi="Arial" w:cs="Arial"/>
+          <w:color w:val="000000" w:themeColor="text1"/>
+          <w:lang w:val="hu-HU"/>
+        </w:rPr>
+        <w:t>Node</w:t>
+      </w:r>
+      <w:proofErr w:type="spellEnd"/>
+      <w:r>
+        <w:rPr>
+          <w:rFonts w:ascii="Arial" w:hAnsi="Arial" w:cs="Arial"/>
+          <w:color w:val="000000" w:themeColor="text1"/>
+          <w:lang w:val="hu-HU"/>
+        </w:rPr>
+        <w:t>: Van egy Id-je és egy neve. Függvényei visszaadják az elemeit, van egy == és egy ostream operátora.</w:t>
+      </w:r>
+    </w:p>
+    <w:p>
+      <w:pPr>
+        <w:pStyle w:val="ListParagraph"/>
+        <w:widowControl w:val="0"/>
+        <w:numPr>
+          <w:ilvl w:val="1"/>
+          <w:numId w:val="1"/>
+        </w:numPr>
+        <w:rPr>
+          <w:rFonts w:ascii="Arial" w:hAnsi="Arial" w:cs="Arial"/>
+          <w:color w:val="000000" w:themeColor="text1"/>
+          <w:lang w:val="hu-HU"/>
+        </w:rPr>
+      </w:pPr>
+      <w:proofErr w:type="spellStart"/>
+      <w:r>
+        <w:rPr>
+          <w:rFonts w:ascii="Arial" w:hAnsi="Arial" w:cs="Arial"/>
+          <w:color w:val="000000" w:themeColor="text1"/>
+          <w:lang w:val="hu-HU"/>
+        </w:rPr>
+        <w:t>Grpah</w:t>
+      </w:r>
+      <w:proofErr w:type="spellEnd"/>
+      <w:r>
+        <w:rPr>
+          <w:rFonts w:ascii="Arial" w:hAnsi="Arial" w:cs="Arial"/>
+          <w:color w:val="000000" w:themeColor="text1"/>
+          <w:lang w:val="hu-HU"/>
+        </w:rPr>
+        <w:t>:</w:t>
+      </w:r>
+    </w:p>
+    <w:p>
+      <w:pPr>
+        <w:pStyle w:val="ListParagraph"/>
+        <w:widowControl w:val="0"/>
+        <w:numPr>
+          <w:ilvl w:val="2"/>
+          <w:numId w:val="1"/>
+        </w:numPr>
+        <w:rPr>
+          <w:rFonts w:ascii="Arial" w:hAnsi="Arial" w:cs="Arial"/>
+          <w:color w:val="000000" w:themeColor="text1"/>
+          <w:lang w:val="hu-HU"/>
+        </w:rPr>
+      </w:pPr>
+      <w:proofErr w:type="spellStart"/>
+      <w:r>
+        <w:rPr>
+          <w:rFonts w:ascii="Arial" w:hAnsi="Arial" w:cs="Arial"/>
+          <w:color w:val="000000" w:themeColor="text1"/>
+          <w:lang w:val="hu-HU"/>
+        </w:rPr>
+        <w:t>getNodes</w:t>
+      </w:r>
+      <w:proofErr w:type="spellEnd"/>
+      <w:r>
+        <w:rPr>
+          <w:rFonts w:ascii="Arial" w:hAnsi="Arial" w:cs="Arial"/>
+          <w:color w:val="000000" w:themeColor="text1"/>
+          <w:lang w:val="hu-HU"/>
+        </w:rPr>
+        <w:t xml:space="preserve">: Visszaadja a </w:t>
+      </w:r>
+      <w:proofErr w:type="spellStart"/>
+      <w:r>
+        <w:rPr>
+          <w:rFonts w:ascii="Arial" w:hAnsi="Arial" w:cs="Arial"/>
+          <w:color w:val="000000" w:themeColor="text1"/>
+          <w:lang w:val="hu-HU"/>
+        </w:rPr>
+        <w:t>Nodeokat</w:t>
+      </w:r>
+      <w:proofErr w:type="spellEnd"/>
+      <w:r>
+        <w:rPr>
+          <w:rFonts w:ascii="Arial" w:hAnsi="Arial" w:cs="Arial"/>
+          <w:color w:val="000000" w:themeColor="text1"/>
+          <w:lang w:val="hu-HU"/>
+        </w:rPr>
+        <w:t>.</w:t>
+      </w:r>
+    </w:p>
+    <w:p>
+      <w:pPr>
+        <w:pStyle w:val="ListParagraph"/>
+        <w:widowControl w:val="0"/>
+        <w:numPr>
+          <w:ilvl w:val="2"/>
+          <w:numId w:val="1"/>
+        </w:numPr>
+        <w:rPr>
+          <w:rFonts w:ascii="Arial" w:hAnsi="Arial" w:cs="Arial"/>
+          <w:color w:val="000000" w:themeColor="text1"/>
+          <w:lang w:val="hu-HU"/>
+        </w:rPr>
+      </w:pPr>
+      <w:proofErr w:type="spellStart"/>
+      <w:r>
+        <w:rPr>
+          <w:rFonts w:ascii="Arial" w:hAnsi="Arial" w:cs="Arial"/>
+          <w:color w:val="000000" w:themeColor="text1"/>
+          <w:lang w:val="hu-HU"/>
+        </w:rPr>
+        <w:t>getEdges</w:t>
+      </w:r>
+      <w:proofErr w:type="spellEnd"/>
+      <w:r>
+        <w:rPr>
+          <w:rFonts w:ascii="Arial" w:hAnsi="Arial" w:cs="Arial"/>
+          <w:color w:val="000000" w:themeColor="text1"/>
+          <w:lang w:val="hu-HU"/>
+        </w:rPr>
+        <w:t xml:space="preserve">: Visszaadja az </w:t>
+      </w:r>
+      <w:proofErr w:type="spellStart"/>
+      <w:r>
+        <w:rPr>
+          <w:rFonts w:ascii="Arial" w:hAnsi="Arial" w:cs="Arial"/>
+          <w:color w:val="000000" w:themeColor="text1"/>
+          <w:lang w:val="hu-HU"/>
+        </w:rPr>
+        <w:t>Edgeket</w:t>
+      </w:r>
+      <w:proofErr w:type="spellEnd"/>
+      <w:r>
+        <w:rPr>
+          <w:rFonts w:ascii="Arial" w:hAnsi="Arial" w:cs="Arial"/>
+          <w:color w:val="000000" w:themeColor="text1"/>
+          <w:lang w:val="hu-HU"/>
+        </w:rPr>
+        <w:t>.</w:t>
+      </w:r>
+    </w:p>
+    <w:p>
+      <w:pPr>
+        <w:pStyle w:val="ListParagraph"/>
+        <w:widowControl w:val="0"/>
+        <w:numPr>
+          <w:ilvl w:val="2"/>
+          <w:numId w:val="1"/>
+        </w:numPr>
+        <w:rPr>
+          <w:rFonts w:ascii="Arial" w:hAnsi="Arial" w:cs="Arial"/>
+          <w:color w:val="000000" w:themeColor="text1"/>
+          <w:lang w:val="hu-HU"/>
+        </w:rPr>
+      </w:pPr>
+      <w:proofErr w:type="spellStart"/>
+      <w:r>
+        <w:rPr>
+          <w:rFonts w:ascii="Arial" w:hAnsi="Arial" w:cs="Arial"/>
+          <w:color w:val="000000" w:themeColor="text1"/>
+          <w:lang w:val="hu-HU"/>
+        </w:rPr>
+        <w:t>addNode</w:t>
+      </w:r>
+      <w:proofErr w:type="spellEnd"/>
+      <w:r>
+        <w:rPr>
+          <w:rFonts w:ascii="Arial" w:hAnsi="Arial" w:cs="Arial"/>
+          <w:color w:val="000000" w:themeColor="text1"/>
+          <w:lang w:val="hu-HU"/>
+        </w:rPr>
+        <w:t xml:space="preserve">: Hozzáad a </w:t>
+      </w:r>
+      <w:proofErr w:type="spellStart"/>
+      <w:r>
+        <w:rPr>
+          <w:rFonts w:ascii="Arial" w:hAnsi="Arial" w:cs="Arial"/>
+          <w:color w:val="000000" w:themeColor="text1"/>
+          <w:lang w:val="hu-HU"/>
+        </w:rPr>
+        <w:t>nodes</w:t>
+      </w:r>
+      <w:proofErr w:type="spellEnd"/>
+      <w:r>
+        <w:rPr>
+          <w:rFonts w:ascii="Arial" w:hAnsi="Arial" w:cs="Arial"/>
+          <w:color w:val="000000" w:themeColor="text1"/>
+          <w:lang w:val="hu-HU"/>
+        </w:rPr>
+        <w:t xml:space="preserve"> vektor végéhez egy pontot, amit megadunk neki.</w:t>
+      </w:r>
+    </w:p>
+    <w:p>
+      <w:pPr>
+        <w:pStyle w:val="ListParagraph"/>
+        <w:widowControl w:val="0"/>
+        <w:numPr>
+          <w:ilvl w:val="2"/>
+          <w:numId w:val="1"/>
+        </w:numPr>
+        <w:rPr>
+          <w:rFonts w:ascii="Arial" w:hAnsi="Arial" w:cs="Arial"/>
+          <w:color w:val="000000" w:themeColor="text1"/>
+          <w:lang w:val="hu-HU"/>
+        </w:rPr>
+      </w:pPr>
+      <w:proofErr w:type="spellStart"/>
+      <w:r>
+        <w:rPr>
+          <w:rFonts w:ascii="Arial" w:hAnsi="Arial" w:cs="Arial"/>
+          <w:color w:val="000000" w:themeColor="text1"/>
+          <w:lang w:val="hu-HU"/>
+        </w:rPr>
+        <w:t>addEdge</w:t>
+      </w:r>
+      <w:proofErr w:type="spellEnd"/>
+      <w:r>
+        <w:rPr>
+          <w:rFonts w:ascii="Arial" w:hAnsi="Arial" w:cs="Arial"/>
+          <w:color w:val="000000" w:themeColor="text1"/>
+          <w:lang w:val="hu-HU"/>
+        </w:rPr>
+        <w:t>: Hozzáad egy új Edge-et, Megadott név, két pont és hossz alapján.</w:t>
+      </w:r>
+    </w:p>
+    <w:p>
+      <w:pPr>
+        <w:pStyle w:val="ListParagraph"/>
+        <w:widowControl w:val="0"/>
+        <w:numPr>
+          <w:ilvl w:val="2"/>
+          <w:numId w:val="1"/>
+        </w:numPr>
+        <w:rPr>
+          <w:rFonts w:ascii="Arial" w:hAnsi="Arial" w:cs="Arial"/>
+          <w:color w:val="000000" w:themeColor="text1"/>
+          <w:lang w:val="hu-HU"/>
+        </w:rPr>
+      </w:pPr>
+      <w:proofErr w:type="spellStart"/>
+      <w:r>
+        <w:rPr>
+          <w:rFonts w:ascii="Arial" w:hAnsi="Arial" w:cs="Arial"/>
+          <w:color w:val="000000" w:themeColor="text1"/>
+          <w:lang w:val="hu-HU"/>
+        </w:rPr>
+        <w:t>listNodes</w:t>
+      </w:r>
+      <w:proofErr w:type="spellEnd"/>
+      <w:r>
+        <w:rPr>
+          <w:rFonts w:ascii="Arial" w:hAnsi="Arial" w:cs="Arial"/>
+          <w:color w:val="000000" w:themeColor="text1"/>
+          <w:lang w:val="hu-HU"/>
+        </w:rPr>
+        <w:t>: Kiírja az összes pontot a gráfban.</w:t>
+      </w:r>
+    </w:p>
+    <w:p>
+      <w:pPr>
+        <w:pStyle w:val="ListParagraph"/>
+        <w:widowControl w:val="0"/>
+        <w:numPr>
+          <w:ilvl w:val="2"/>
+          <w:numId w:val="1"/>
+        </w:numPr>
+        <w:rPr>
+          <w:rFonts w:ascii="Arial" w:hAnsi="Arial" w:cs="Arial"/>
+          <w:color w:val="000000" w:themeColor="text1"/>
+          <w:lang w:val="hu-HU"/>
+        </w:rPr>
+      </w:pPr>
+      <w:proofErr w:type="spellStart"/>
+      <w:r>
+        <w:rPr>
+          <w:rFonts w:ascii="Arial" w:hAnsi="Arial" w:cs="Arial"/>
+          <w:color w:val="000000" w:themeColor="text1"/>
+          <w:lang w:val="hu-HU"/>
+        </w:rPr>
+        <w:t>findNodebyname</w:t>
+      </w:r>
+      <w:proofErr w:type="spellEnd"/>
+      <w:r>
+        <w:rPr>
+          <w:rFonts w:ascii="Arial" w:hAnsi="Arial" w:cs="Arial"/>
+          <w:color w:val="000000" w:themeColor="text1"/>
+          <w:lang w:val="hu-HU"/>
+        </w:rPr>
+        <w:t>: Visszaad egy pontot a neve szerint keresve. Ez kell az útvonalkereső algoritmushoz.</w:t>
+      </w:r>
+    </w:p>
+    <w:p>
+      <w:pPr>
+        <w:pStyle w:val="ListParagraph"/>
+        <w:widowControl w:val="0"/>
+        <w:numPr>
+          <w:ilvl w:val="2"/>
+          <w:numId w:val="1"/>
+        </w:numPr>
+        <w:rPr>
+          <w:rFonts w:ascii="Arial" w:hAnsi="Arial" w:cs="Arial"/>
+          <w:color w:val="000000" w:themeColor="text1"/>
+          <w:lang w:val="hu-HU"/>
+        </w:rPr>
+      </w:pPr>
+      <w:proofErr w:type="spellStart"/>
+      <w:r>
+        <w:rPr>
+          <w:rFonts w:ascii="Arial" w:hAnsi="Arial" w:cs="Arial"/>
+          <w:color w:val="000000" w:themeColor="text1"/>
+          <w:lang w:val="hu-HU"/>
+        </w:rPr>
+        <w:t>getConnection</w:t>
+      </w:r>
+      <w:proofErr w:type="spellEnd"/>
+      <w:r>
+        <w:rPr>
+          <w:rFonts w:ascii="Arial" w:hAnsi="Arial" w:cs="Arial"/>
+          <w:color w:val="000000" w:themeColor="text1"/>
+          <w:lang w:val="hu-HU"/>
+        </w:rPr>
+        <w:t xml:space="preserve">: Visszaadja egy ponthoz éllel kapcsolatos összes többi pontot egy </w:t>
+      </w:r>
+      <w:proofErr w:type="spellStart"/>
+      <w:r>
+        <w:rPr>
+          <w:rFonts w:ascii="Arial" w:hAnsi="Arial" w:cs="Arial"/>
+          <w:color w:val="000000" w:themeColor="text1"/>
+          <w:lang w:val="hu-HU"/>
+        </w:rPr>
+        <w:t>vectorban</w:t>
+      </w:r>
+      <w:proofErr w:type="spellEnd"/>
+      <w:r>
+        <w:rPr>
+          <w:rFonts w:ascii="Arial" w:hAnsi="Arial" w:cs="Arial"/>
+          <w:color w:val="000000" w:themeColor="text1"/>
+          <w:lang w:val="hu-HU"/>
+        </w:rPr>
+        <w:t>.</w:t>
+      </w:r>
+    </w:p>
+    <w:p>
+      <w:pPr>
+        <w:pStyle w:val="ListParagraph"/>
+        <w:widowControl w:val="0"/>
+        <w:numPr>
+          <w:ilvl w:val="2"/>
+          <w:numId w:val="1"/>
+        </w:numPr>
+        <w:rPr>
+          <w:rFonts w:ascii="Arial" w:hAnsi="Arial" w:cs="Arial"/>
+          <w:color w:val="000000" w:themeColor="text1"/>
+          <w:lang w:val="hu-HU"/>
+        </w:rPr>
+      </w:pPr>
+      <w:proofErr w:type="spellStart"/>
+      <w:r>
+        <w:rPr>
+          <w:rFonts w:ascii="Arial" w:hAnsi="Arial" w:cs="Arial"/>
+          <w:color w:val="000000" w:themeColor="text1"/>
+          <w:lang w:val="hu-HU"/>
+        </w:rPr>
+        <w:t>findPath</w:t>
+      </w:r>
+      <w:proofErr w:type="spellEnd"/>
+      <w:r>
+        <w:rPr>
+          <w:rFonts w:ascii="Arial" w:hAnsi="Arial" w:cs="Arial"/>
+          <w:color w:val="000000" w:themeColor="text1"/>
+          <w:lang w:val="hu-HU"/>
+        </w:rPr>
+        <w:t xml:space="preserve">: Maga a dijkstra útvonalkeresés. </w:t>
+      </w:r>
+      <w:r>
+        <w:rPr>
+          <w:rFonts w:ascii="Arial" w:hAnsi="Arial" w:cs="Arial"/>
+          <w:color w:val="000000" w:themeColor="text1"/>
+          <w:lang w:val="hu-HU"/>
+        </w:rPr>
+        <w:t>Két pont alapján visszaadja a köztük legrövidebb út mentén érintendő pontokat.</w:t>
+      </w:r>
+    </w:p>
+    <w:p>
+      <w:pPr>
+        <w:pStyle w:val="ListParagraph"/>
+        <w:widowControl w:val="0"/>
+        <w:numPr>
+          <w:ilvl w:val="0"/>
+          <w:numId w:val="1"/>
+        </w:numPr>
+        <w:rPr>
+          <w:rFonts w:ascii="Arial" w:hAnsi="Arial" w:cs="Arial"/>
+          <w:color w:val="000000" w:themeColor="text1"/>
+          <w:lang w:val="hu-HU"/>
+        </w:rPr>
+      </w:pPr>
+      <w:r>
+        <w:rPr>
+          <w:rFonts w:ascii="Arial" w:hAnsi="Arial" w:cs="Arial"/>
+          <w:color w:val="000000" w:themeColor="text1"/>
+          <w:lang w:val="hu-HU"/>
+        </w:rPr>
+        <w:t>Tervezés:</w:t>
+      </w:r>
+      <w:r>
+        <w:rPr>
+          <w:rFonts w:ascii="Arial" w:hAnsi="Arial" w:cs="Arial"/>
+          <w:color w:val="000000" w:themeColor="text1"/>
+          <w:lang w:val="hu-HU"/>
+        </w:rPr>
+        <w:t xml:space="preserve"> Van egy Planner osztály, ami a tervezéshez használt gráfot, a gráf tárolására szolgáló file-t és a felhasználó sétatempóját. Főbb függvényei:</w:t>
+      </w:r>
+    </w:p>
+    <w:p>
+      <w:pPr>
+        <w:pStyle w:val="ListParagraph"/>
+        <w:widowControl w:val="0"/>
+        <w:numPr>
+          <w:ilvl w:val="1"/>
+          <w:numId w:val="1"/>
+        </w:numPr>
+        <w:rPr>
+          <w:rFonts w:ascii="Arial" w:hAnsi="Arial" w:cs="Arial"/>
+          <w:color w:val="000000" w:themeColor="text1"/>
+          <w:lang w:val="hu-HU"/>
+        </w:rPr>
+      </w:pPr>
+      <w:proofErr w:type="spellStart"/>
+      <w:r>
+        <w:rPr>
+          <w:rFonts w:ascii="Arial" w:hAnsi="Arial" w:cs="Arial"/>
+          <w:color w:val="000000" w:themeColor="text1"/>
+          <w:lang w:val="hu-HU"/>
+        </w:rPr>
+        <w:t>routePlanner</w:t>
+      </w:r>
+      <w:proofErr w:type="spellEnd"/>
+      <w:r>
+        <w:rPr>
+          <w:rFonts w:ascii="Arial" w:hAnsi="Arial" w:cs="Arial"/>
+          <w:color w:val="000000" w:themeColor="text1"/>
+          <w:lang w:val="hu-HU"/>
+        </w:rPr>
+        <w:t>: Megtervezi a megadott nevek álltal a legjobb útvonalat a két pont között és kiírja a végeredményt.</w:t>
+      </w:r>
+    </w:p>
+    <w:p>
+      <w:pPr>
+        <w:pStyle w:val="ListParagraph"/>
+        <w:widowControl w:val="0"/>
+        <w:numPr>
+          <w:ilvl w:val="1"/>
+          <w:numId w:val="1"/>
+        </w:numPr>
+        <w:rPr>
+          <w:rFonts w:ascii="Arial" w:hAnsi="Arial" w:cs="Arial"/>
+          <w:color w:val="000000" w:themeColor="text1"/>
+          <w:lang w:val="hu-HU"/>
+        </w:rPr>
+      </w:pPr>
+      <w:proofErr w:type="spellStart"/>
+      <w:r>
+        <w:rPr>
+          <w:rFonts w:ascii="Arial" w:hAnsi="Arial" w:cs="Arial"/>
+          <w:color w:val="000000" w:themeColor="text1"/>
+          <w:lang w:val="hu-HU"/>
+        </w:rPr>
+        <w:t>printRoute</w:t>
+      </w:r>
+      <w:proofErr w:type="spellEnd"/>
+      <w:r>
+        <w:rPr>
+          <w:rFonts w:ascii="Arial" w:hAnsi="Arial" w:cs="Arial"/>
+          <w:color w:val="000000" w:themeColor="text1"/>
+          <w:lang w:val="hu-HU"/>
+        </w:rPr>
+        <w:t xml:space="preserve">: Kiírja a végeredményt a tervezés után. Különbséget </w:t>
+      </w:r>
+      <w:r>
+        <w:rPr>
+          <w:rFonts w:ascii="Arial" w:hAnsi="Arial" w:cs="Arial"/>
+          <w:color w:val="000000" w:themeColor="text1"/>
+          <w:lang w:val="hu-HU"/>
+        </w:rPr>
+        <w:t>tesz,</w:t>
+      </w:r>
+      <w:r>
+        <w:rPr>
+          <w:rFonts w:ascii="Arial" w:hAnsi="Arial" w:cs="Arial"/>
+          <w:color w:val="000000" w:themeColor="text1"/>
+          <w:lang w:val="hu-HU"/>
+        </w:rPr>
+        <w:t xml:space="preserve"> ha nincs útvonal, ha már a célban áll a </w:t>
+      </w:r>
+      <w:proofErr w:type="spellStart"/>
+      <w:r>
+        <w:rPr>
+          <w:rFonts w:ascii="Arial" w:hAnsi="Arial" w:cs="Arial"/>
+          <w:color w:val="000000" w:themeColor="text1"/>
+          <w:lang w:val="hu-HU"/>
+        </w:rPr>
+        <w:t>felhsználó</w:t>
+      </w:r>
+      <w:proofErr w:type="spellEnd"/>
+      <w:r>
+        <w:rPr>
+          <w:rFonts w:ascii="Arial" w:hAnsi="Arial" w:cs="Arial"/>
+          <w:color w:val="000000" w:themeColor="text1"/>
+          <w:lang w:val="hu-HU"/>
+        </w:rPr>
+        <w:t xml:space="preserve">, vagy az útvonal között. </w:t>
+      </w:r>
+      <w:r>
+        <w:rPr>
+          <w:rFonts w:ascii="Arial" w:hAnsi="Arial" w:cs="Arial"/>
+          <w:color w:val="000000" w:themeColor="text1"/>
+          <w:lang w:val="hu-HU"/>
+        </w:rPr>
+        <w:t>Lekéri és az összeadott távval kiszámolja a séta idejét.</w:t>
+      </w:r>
+    </w:p>
+    <w:p>
+      <w:pPr>
+        <w:pStyle w:val="ListParagraph"/>
+        <w:widowControl w:val="0"/>
+        <w:numPr>
+          <w:ilvl w:val="1"/>
+          <w:numId w:val="1"/>
+        </w:numPr>
+        <w:rPr>
+          <w:rFonts w:ascii="Arial" w:hAnsi="Arial" w:cs="Arial"/>
+          <w:color w:val="000000" w:themeColor="text1"/>
+          <w:lang w:val="hu-HU"/>
+        </w:rPr>
+      </w:pPr>
+      <w:proofErr w:type="spellStart"/>
+      <w:r>
+        <w:rPr>
+          <w:rFonts w:ascii="Arial" w:hAnsi="Arial" w:cs="Arial"/>
+          <w:color w:val="000000" w:themeColor="text1"/>
+          <w:lang w:val="hu-HU"/>
+        </w:rPr>
+        <w:t>setWalkingspeed</w:t>
+      </w:r>
+      <w:proofErr w:type="spellEnd"/>
+      <w:r>
+        <w:rPr>
+          <w:rFonts w:ascii="Arial" w:hAnsi="Arial" w:cs="Arial"/>
+          <w:color w:val="000000" w:themeColor="text1"/>
+          <w:lang w:val="hu-HU"/>
+        </w:rPr>
+        <w:t>:</w:t>
+      </w:r>
+      <w:r>
+        <w:rPr>
+          <w:rFonts w:ascii="Arial" w:hAnsi="Arial" w:cs="Arial"/>
+          <w:color w:val="000000" w:themeColor="text1"/>
+          <w:lang w:val="hu-HU"/>
+        </w:rPr>
+        <w:t xml:space="preserve"> Beállítja a felhasználó sétatempóját.</w:t>
+      </w:r>
+    </w:p>
+    <w:p>
+      <w:pPr>
+        <w:pStyle w:val="ListParagraph"/>
+        <w:widowControl w:val="0"/>
+        <w:numPr>
+          <w:ilvl w:val="1"/>
+          <w:numId w:val="1"/>
+        </w:numPr>
+        <w:rPr>
+          <w:rFonts w:ascii="Arial" w:hAnsi="Arial" w:cs="Arial"/>
+          <w:color w:val="000000" w:themeColor="text1"/>
+          <w:lang w:val="hu-HU"/>
+        </w:rPr>
+      </w:pPr>
+      <w:proofErr w:type="spellStart"/>
+      <w:r>
+        <w:rPr>
+          <w:rFonts w:ascii="Arial" w:hAnsi="Arial" w:cs="Arial"/>
+          <w:color w:val="000000" w:themeColor="text1"/>
+          <w:lang w:val="hu-HU"/>
+        </w:rPr>
+        <w:t>addNewEdge</w:t>
+      </w:r>
+      <w:proofErr w:type="spellEnd"/>
+      <w:r>
+        <w:rPr>
+          <w:rFonts w:ascii="Arial" w:hAnsi="Arial" w:cs="Arial"/>
+          <w:color w:val="000000" w:themeColor="text1"/>
+          <w:lang w:val="hu-HU"/>
+        </w:rPr>
+        <w:t>:</w:t>
+      </w:r>
+      <w:r>
+        <w:rPr>
+          <w:rFonts w:ascii="Arial" w:hAnsi="Arial" w:cs="Arial"/>
+          <w:color w:val="000000" w:themeColor="text1"/>
+          <w:lang w:val="hu-HU"/>
+        </w:rPr>
+        <w:t xml:space="preserve"> Hozzáad egy megadott név két pont és egy hossz alapján egy új élet a tervezéshez használt gráfhoz.</w:t>
+      </w:r>
+    </w:p>
+    <w:p>
+      <w:pPr>
+        <w:pStyle w:val="ListParagraph"/>
+        <w:widowControl w:val="0"/>
+        <w:numPr>
+          <w:ilvl w:val="1"/>
+          <w:numId w:val="1"/>
+        </w:numPr>
+        <w:rPr>
+          <w:rFonts w:ascii="Arial" w:hAnsi="Arial" w:cs="Arial"/>
+          <w:color w:val="000000" w:themeColor="text1"/>
+          <w:lang w:val="hu-HU"/>
+        </w:rPr>
+      </w:pPr>
+      <w:proofErr w:type="spellStart"/>
+      <w:r>
+        <w:rPr>
+          <w:rFonts w:ascii="Arial" w:hAnsi="Arial" w:cs="Arial"/>
+          <w:color w:val="000000" w:themeColor="text1"/>
+          <w:lang w:val="hu-HU"/>
+        </w:rPr>
+        <w:t>addNewNode</w:t>
+      </w:r>
+      <w:proofErr w:type="spellEnd"/>
+      <w:r>
+        <w:rPr>
+          <w:rFonts w:ascii="Arial" w:hAnsi="Arial" w:cs="Arial"/>
+          <w:color w:val="000000" w:themeColor="text1"/>
+          <w:lang w:val="hu-HU"/>
+        </w:rPr>
+        <w:t>:</w:t>
+      </w:r>
+      <w:r>
+        <w:rPr>
+          <w:rFonts w:ascii="Arial" w:hAnsi="Arial" w:cs="Arial"/>
+          <w:color w:val="000000" w:themeColor="text1"/>
+          <w:lang w:val="hu-HU"/>
+        </w:rPr>
+        <w:t xml:space="preserve"> Egy név alapján hozzáad egy új pontot a gráfhoz.</w:t>
+      </w:r>
+    </w:p>
+    <w:p>
+      <w:pPr>
+        <w:pStyle w:val="ListParagraph"/>
+        <w:widowControl w:val="0"/>
+        <w:numPr>
+          <w:ilvl w:val="1"/>
+          <w:numId w:val="1"/>
+        </w:numPr>
+        <w:rPr>
+          <w:rFonts w:ascii="Arial" w:hAnsi="Arial" w:cs="Arial"/>
+          <w:color w:val="000000" w:themeColor="text1"/>
+          <w:lang w:val="hu-HU"/>
+        </w:rPr>
+      </w:pPr>
+      <w:proofErr w:type="spellStart"/>
+      <w:r>
+        <w:rPr>
+          <w:rFonts w:ascii="Arial" w:hAnsi="Arial" w:cs="Arial"/>
+          <w:color w:val="000000" w:themeColor="text1"/>
+          <w:lang w:val="hu-HU"/>
+        </w:rPr>
+        <w:t>loadData</w:t>
+      </w:r>
+      <w:proofErr w:type="spellEnd"/>
+      <w:r>
+        <w:rPr>
+          <w:rFonts w:ascii="Arial" w:hAnsi="Arial" w:cs="Arial"/>
+          <w:color w:val="000000" w:themeColor="text1"/>
+          <w:lang w:val="hu-HU"/>
+        </w:rPr>
+        <w:t>:</w:t>
+      </w:r>
+      <w:r>
+        <w:rPr>
+          <w:rFonts w:ascii="Arial" w:hAnsi="Arial" w:cs="Arial"/>
+          <w:color w:val="000000" w:themeColor="text1"/>
+          <w:lang w:val="hu-HU"/>
+        </w:rPr>
+        <w:t xml:space="preserve"> A </w:t>
+      </w:r>
+      <w:proofErr w:type="spellStart"/>
+      <w:r>
+        <w:rPr>
+          <w:rFonts w:ascii="Arial" w:hAnsi="Arial" w:cs="Arial"/>
+          <w:color w:val="000000" w:themeColor="text1"/>
+          <w:lang w:val="hu-HU"/>
+        </w:rPr>
+        <w:t>filet</w:t>
+      </w:r>
+      <w:proofErr w:type="spellEnd"/>
+      <w:r>
+        <w:rPr>
+          <w:rFonts w:ascii="Arial" w:hAnsi="Arial" w:cs="Arial"/>
+          <w:color w:val="000000" w:themeColor="text1"/>
+          <w:lang w:val="hu-HU"/>
+        </w:rPr>
+        <w:t xml:space="preserve"> </w:t>
+      </w:r>
+      <w:proofErr w:type="spellStart"/>
+      <w:r>
+        <w:rPr>
+          <w:rFonts w:ascii="Arial" w:hAnsi="Arial" w:cs="Arial"/>
+          <w:color w:val="000000" w:themeColor="text1"/>
+          <w:lang w:val="hu-HU"/>
+        </w:rPr>
+        <w:t>átvéve</w:t>
+      </w:r>
+      <w:proofErr w:type="spellEnd"/>
+      <w:r>
+        <w:rPr>
+          <w:rFonts w:ascii="Arial" w:hAnsi="Arial" w:cs="Arial"/>
+          <w:color w:val="000000" w:themeColor="text1"/>
+          <w:lang w:val="hu-HU"/>
+        </w:rPr>
+        <w:t xml:space="preserve"> betölti az eltárolt gráfot egy TXT-ből.</w:t>
+      </w:r>
+    </w:p>
+    <w:p>
+      <w:pPr>
+        <w:pStyle w:val="ListParagraph"/>
+        <w:widowControl w:val="0"/>
+        <w:numPr>
+          <w:ilvl w:val="1"/>
+          <w:numId w:val="1"/>
+        </w:numPr>
+        <w:rPr>
+          <w:rFonts w:ascii="Arial" w:hAnsi="Arial" w:cs="Arial"/>
+          <w:color w:val="000000" w:themeColor="text1"/>
+          <w:lang w:val="hu-HU"/>
+        </w:rPr>
+      </w:pPr>
+      <w:proofErr w:type="spellStart"/>
+      <w:r>
+        <w:rPr>
+          <w:rFonts w:ascii="Arial" w:hAnsi="Arial" w:cs="Arial"/>
+          <w:color w:val="000000" w:themeColor="text1"/>
+          <w:lang w:val="hu-HU"/>
+        </w:rPr>
+        <w:t>saveData</w:t>
+      </w:r>
+      <w:proofErr w:type="spellEnd"/>
+      <w:r>
+        <w:rPr>
+          <w:rFonts w:ascii="Arial" w:hAnsi="Arial" w:cs="Arial"/>
+          <w:color w:val="000000" w:themeColor="text1"/>
+          <w:lang w:val="hu-HU"/>
+        </w:rPr>
+        <w:t>:</w:t>
+      </w:r>
+      <w:r>
+        <w:rPr>
+          <w:rFonts w:ascii="Arial" w:hAnsi="Arial" w:cs="Arial"/>
+          <w:color w:val="000000" w:themeColor="text1"/>
+          <w:lang w:val="hu-HU"/>
+        </w:rPr>
+        <w:t xml:space="preserve"> Betölti a file-</w:t>
+      </w:r>
+      <w:proofErr w:type="spellStart"/>
+      <w:r>
+        <w:rPr>
+          <w:rFonts w:ascii="Arial" w:hAnsi="Arial" w:cs="Arial"/>
+          <w:color w:val="000000" w:themeColor="text1"/>
+          <w:lang w:val="hu-HU"/>
+        </w:rPr>
+        <w:t>ba</w:t>
+      </w:r>
+      <w:proofErr w:type="spellEnd"/>
+      <w:r>
+        <w:rPr>
+          <w:rFonts w:ascii="Arial" w:hAnsi="Arial" w:cs="Arial"/>
+          <w:color w:val="000000" w:themeColor="text1"/>
+          <w:lang w:val="hu-HU"/>
+        </w:rPr>
+        <w:t xml:space="preserve"> a használt gráfot a megfelelő formátumban.</w:t>
+      </w:r>
+    </w:p>
+    <w:p>
+      <w:pPr>
+        <w:pStyle w:val="ListParagraph"/>
+        <w:widowControl w:val="0"/>
+        <w:rPr>
+          <w:rFonts w:ascii="Arial" w:hAnsi="Arial" w:cs="Arial"/>
+          <w:color w:val="000000" w:themeColor="text1"/>
+          <w:lang w:val="hu-HU"/>
+        </w:rPr>
+      </w:pPr>
+    </w:p>
+    <w:p>
+      <w:pPr>
+        <w:pStyle w:val="ListParagraph"/>
+        <w:widowControl w:val="0"/>
+        <w:rPr>
+          <w:rFonts w:ascii="Arial" w:hAnsi="Arial" w:cs="Arial"/>
+          <w:color w:val="000000" w:themeColor="text1"/>
+          <w:lang w:val="hu-HU"/>
+        </w:rPr>
+      </w:pPr>
+    </w:p>
+    <w:p>
+      <w:pPr>
+        <w:pStyle w:val="ListParagraph"/>
+        <w:widowControl w:val="0"/>
+        <w:numPr>
+          <w:ilvl w:val="0"/>
+          <w:numId w:val="1"/>
+        </w:numPr>
+        <w:rPr>
+          <w:rFonts w:ascii="Arial" w:hAnsi="Arial" w:cs="Arial"/>
+          <w:color w:val="000000" w:themeColor="text1"/>
+          <w:lang w:val="hu-HU"/>
+        </w:rPr>
+      </w:pPr>
+      <w:r>
+        <w:rPr>
+          <w:rFonts w:ascii="Arial" w:hAnsi="Arial" w:cs="Arial"/>
+          <w:color w:val="000000" w:themeColor="text1"/>
+          <w:lang w:val="hu-HU"/>
+        </w:rPr>
+        <w:lastRenderedPageBreak/>
+        <w:t>Main:</w:t>
+      </w:r>
+    </w:p>
+    <w:p>
+      <w:pPr>
+        <w:widowControl w:val="0"/>
+        <w:rPr>
+          <w:rFonts w:ascii="Arial" w:hAnsi="Arial" w:cs="Arial"/>
+          <w:color w:val="000000" w:themeColor="text1"/>
+          <w:lang w:val="hu-HU"/>
+        </w:rPr>
+      </w:pPr>
+      <w:r>
+        <w:rPr>
+          <w:rFonts w:ascii="Arial" w:hAnsi="Arial" w:cs="Arial"/>
+          <w:color w:val="000000" w:themeColor="text1"/>
+          <w:lang w:val="hu-HU"/>
+        </w:rPr>
+        <w:t>Ez a program szíve, itt fut a menü. Először meg kell adni a sétatempót és ez után lép a program a menübe. Onnan 4 opció közül lép tovább a planner funkciói közé.</w:t>
+      </w:r>
+    </w:p>
+    <w:p>
+      <w:pPr>
+        <w:pStyle w:val="ListParagraph"/>
+        <w:widowControl w:val="0"/>
+        <w:numPr>
+          <w:ilvl w:val="0"/>
+          <w:numId w:val="1"/>
+        </w:numPr>
+        <w:rPr>
+          <w:rFonts w:ascii="Arial" w:hAnsi="Arial" w:cs="Arial"/>
+          <w:color w:val="000000" w:themeColor="text1"/>
+          <w:lang w:val="hu-HU"/>
+        </w:rPr>
+      </w:pPr>
+      <w:r>
+        <w:rPr>
+          <w:rFonts w:ascii="Arial" w:hAnsi="Arial" w:cs="Arial"/>
+          <w:color w:val="000000" w:themeColor="text1"/>
+          <w:lang w:val="hu-HU"/>
+        </w:rPr>
+        <w:t>Adat olvasás/írás:</w:t>
+      </w:r>
+    </w:p>
+    <w:p>
+      <w:pPr>
+        <w:pStyle w:val="ListParagraph"/>
+        <w:widowControl w:val="0"/>
+        <w:numPr>
+          <w:ilvl w:val="1"/>
+          <w:numId w:val="1"/>
+        </w:numPr>
+        <w:rPr>
+          <w:rFonts w:ascii="Arial" w:hAnsi="Arial" w:cs="Arial"/>
+          <w:color w:val="000000" w:themeColor="text1"/>
+          <w:lang w:val="hu-HU"/>
+        </w:rPr>
+      </w:pPr>
+      <w:r>
+        <w:rPr>
+          <w:rFonts w:ascii="Arial" w:hAnsi="Arial" w:cs="Arial"/>
+          <w:color w:val="000000" w:themeColor="text1"/>
+          <w:lang w:val="hu-HU"/>
+        </w:rPr>
+        <w:t>A program megnyitja a megadott nevű TXT-t és abból kinyeri a sorokat.</w:t>
+      </w:r>
+    </w:p>
+    <w:p>
+      <w:pPr>
+        <w:pStyle w:val="ListParagraph"/>
+        <w:widowControl w:val="0"/>
+        <w:numPr>
+          <w:ilvl w:val="1"/>
+          <w:numId w:val="1"/>
+        </w:numPr>
+        <w:rPr>
+          <w:rFonts w:ascii="Arial" w:hAnsi="Arial" w:cs="Arial"/>
+          <w:color w:val="000000" w:themeColor="text1"/>
+          <w:lang w:val="hu-HU"/>
+        </w:rPr>
+      </w:pPr>
+      <w:r>
+        <w:rPr>
+          <w:rFonts w:ascii="Arial" w:hAnsi="Arial" w:cs="Arial"/>
+          <w:color w:val="000000" w:themeColor="text1"/>
+          <w:lang w:val="hu-HU"/>
+        </w:rPr>
+        <w:t>Kiírja a TXT-be egy megadott sorokat tároló vektort.</w:t>
+      </w:r>
+    </w:p>
+    <w:p>
+      <w:pPr>
+        <w:pStyle w:val="ListParagraph"/>
+        <w:widowControl w:val="0"/>
+        <w:ind w:left="1440"/>
+        <w:rPr>
+          <w:rFonts w:ascii="Arial" w:hAnsi="Arial" w:cs="Arial"/>
+          <w:color w:val="000000" w:themeColor="text1"/>
+          <w:lang w:val="hu-HU"/>
+        </w:rPr>
+      </w:pPr>
+    </w:p>
+    <w:p>
+      <w:pPr>
+        <w:pStyle w:val="ListParagraph"/>
+        <w:widowControl w:val="0"/>
+        <w:numPr>
+          <w:ilvl w:val="0"/>
+          <w:numId w:val="1"/>
+        </w:numPr>
+        <w:rPr>
+          <w:rFonts w:ascii="Arial" w:hAnsi="Arial" w:cs="Arial"/>
+          <w:color w:val="000000" w:themeColor="text1"/>
+          <w:lang w:val="hu-HU"/>
+        </w:rPr>
+      </w:pPr>
+      <w:r>
+        <w:rPr>
+          <w:rFonts w:ascii="Arial" w:hAnsi="Arial" w:cs="Arial"/>
+          <w:color w:val="000000" w:themeColor="text1"/>
+          <w:lang w:val="hu-HU"/>
+        </w:rPr>
+        <w:t>UML diagramm:</w:t>
+      </w:r>
+    </w:p>
+    <w:p>
+      <w:pPr>
+        <w:widowControl w:val="0"/>
+        <w:rPr>
+          <w:rFonts w:ascii="Arial" w:hAnsi="Arial" w:cs="Arial"/>
+          <w:color w:val="000000" w:themeColor="text1"/>
+          <w:lang w:val="hu-HU"/>
+        </w:rPr>
+      </w:pPr>
+      <w:r>
+        <w:rPr>
+          <w:rFonts w:ascii="Arial" w:hAnsi="Arial" w:cs="Arial"/>
+          <w:noProof/>
+          <w:color w:val="000000" w:themeColor="text1"/>
+          <w:lang w:val="hu-HU"/>
+        </w:rPr>
+        <w:drawing>
+          <wp:inline distT="0" distB="0" distL="0" distR="0" wp14:anchorId="31637FDF" wp14:editId="3FD7356D">
+            <wp:extent cx="5731510" cy="2978785"/>
+            <wp:effectExtent l="0" t="0" r="0" b="5715"/>
+            <wp:docPr id="1064084498" name="Picture 1" descr="A diagram of a computer program&#10;&#10;AI-generated content may be incorrect."/>
+            <wp:cNvGraphicFramePr>
+              <a:graphicFrameLocks xmlns:a="http://schemas.openxmlformats.org/drawingml/2006/main" noChangeAspect="1"/>
+            </wp:cNvGraphicFramePr>
+            <a:graphic xmlns:a="http://schemas.openxmlformats.org/drawingml/2006/main">
+              <a:graphicData uri="http://schemas.openxmlformats.org/drawingml/2006/picture">
+                <pic:pic xmlns:pic="http://schemas.openxmlformats.org/drawingml/2006/picture">
+                  <pic:nvPicPr>
+                    <pic:cNvPr id="1064084498" name="Picture 1" descr="A diagram of a computer program&#10;&#10;AI-generated content may be incorrect."/>
+                    <pic:cNvPicPr/>
+                  </pic:nvPicPr>
+                  <pic:blipFill>
+                    <a:blip r:embed="rId10" cstate="print">
+                      <a:extLst>
+                        <a:ext uri="{28A0092B-C50C-407E-A947-70E740481C1C}">
+                          <a14:useLocalDpi xmlns:a14="http://schemas.microsoft.com/office/drawing/2010/main" val="0"/>
+                        </a:ext>
+                      </a:extLst>
+                    </a:blip>
+                    <a:stretch>
+                      <a:fillRect/>
+                    </a:stretch>
+                  </pic:blipFill>
+                  <pic:spPr>
+                    <a:xfrm>
+                      <a:off x="0" y="0"/>
+                      <a:ext cx="5731510" cy="2978785"/>
+                    </a:xfrm>
+                    <a:prstGeom prst="rect">
+                      <a:avLst/>
+                    </a:prstGeom>
+                  </pic:spPr>
+                </pic:pic>
+              </a:graphicData>
+            </a:graphic>
+          </wp:inline>
+        </w:drawing>
+      </w:r>
+    </w:p>
+    <w:p>
+      <w:pPr>
         <w:pageBreakBefore/>
+        <w:rPr>
+          <w:rFonts w:ascii="Arial" w:hAnsi="Arial" w:cs="Arial"/>
+          <w:color w:val="800000"/>
+          <w:sz w:val="32"/>
+          <w:szCs w:val="32"/>
+          <w:lang w:val="hu-HU"/>
+        </w:rPr>
+      </w:pPr>
+      <w:r>
+        <w:rPr>
+          <w:rFonts w:ascii="Arial" w:hAnsi="Arial" w:cs="Arial"/>
+          <w:color w:val="800000"/>
+          <w:sz w:val="32"/>
+          <w:szCs w:val="32"/>
+          <w:lang w:val="hu-HU"/>
+        </w:rPr>
+        <w:lastRenderedPageBreak/>
+        <w:t>Felhasználói kézikönyv:</w:t>
+      </w:r>
+    </w:p>
+    <w:p>
+      <w:pPr>
+        <w:pStyle w:val="ListParagraph"/>
         <w:widowControl w:val="0"/>
         <w:numPr>
           <w:ilvl w:val="0"/>
@@ -1527,55 +3148,38 @@
         <w:ind w:left="714" w:hanging="357"/>
         <w:rPr>
           <w:rFonts w:ascii="Arial" w:hAnsi="Arial" w:cs="Arial"/>
-          <w:color w:val="000000" w:themeColor="text1"/>
-          <w:lang w:val="hu-HU"/>
-        </w:rPr>
-      </w:pPr>
-      <w:r>
-        <w:rPr>
-          <w:rFonts w:ascii="Arial" w:hAnsi="Arial" w:cs="Arial"/>
-          <w:color w:val="000000" w:themeColor="text1"/>
-          <w:lang w:val="hu-HU"/>
-        </w:rPr>
-        <w:lastRenderedPageBreak/>
-        <w:t xml:space="preserve">A program egy main programban kezdődik, ami létrehoz egy </w:t>
-      </w:r>
-      <w:proofErr w:type="spellStart"/>
-      <w:r>
-        <w:rPr>
-          <w:rFonts w:ascii="Arial" w:hAnsi="Arial" w:cs="Arial"/>
-          <w:color w:val="000000" w:themeColor="text1"/>
-          <w:lang w:val="hu-HU"/>
-        </w:rPr>
-        <w:t>plannert</w:t>
-      </w:r>
-      <w:proofErr w:type="spellEnd"/>
-      <w:r>
-        <w:rPr>
-          <w:rFonts w:ascii="Arial" w:hAnsi="Arial" w:cs="Arial"/>
-          <w:color w:val="000000" w:themeColor="text1"/>
-          <w:lang w:val="hu-HU"/>
-        </w:rPr>
-        <w:t xml:space="preserve"> és benne fut a menü egy </w:t>
-      </w:r>
-      <w:proofErr w:type="spellStart"/>
-      <w:r>
-        <w:rPr>
-          <w:rFonts w:ascii="Arial" w:hAnsi="Arial" w:cs="Arial"/>
-          <w:color w:val="000000" w:themeColor="text1"/>
-          <w:lang w:val="hu-HU"/>
-        </w:rPr>
-        <w:t>while</w:t>
-      </w:r>
-      <w:proofErr w:type="spellEnd"/>
-      <w:r>
-        <w:rPr>
-          <w:rFonts w:ascii="Arial" w:hAnsi="Arial" w:cs="Arial"/>
-          <w:color w:val="000000" w:themeColor="text1"/>
-          <w:lang w:val="hu-HU"/>
-        </w:rPr>
-        <w:t xml:space="preserve"> ciklusban. Innen tudja a felhasználó input megadásával belépni a program funkciójába.</w:t>
-      </w:r>
+          <w:b/>
+          <w:bCs/>
+          <w:color w:val="000000" w:themeColor="text1"/>
+          <w:sz w:val="28"/>
+          <w:szCs w:val="28"/>
+          <w:lang w:val="hu-HU"/>
+        </w:rPr>
+      </w:pPr>
+      <w:r>
+        <w:rPr>
+          <w:rFonts w:ascii="Arial" w:hAnsi="Arial" w:cs="Arial"/>
+          <w:b/>
+          <w:bCs/>
+          <w:color w:val="000000" w:themeColor="text1"/>
+          <w:sz w:val="28"/>
+          <w:szCs w:val="28"/>
+          <w:lang w:val="hu-HU"/>
+        </w:rPr>
+        <w:t>Linux alapú operációs rendszeren:</w:t>
+      </w:r>
+    </w:p>
+    <w:p>
+      <w:pPr>
+        <w:pStyle w:val="ListParagraph"/>
+        <w:widowControl w:val="0"/>
+        <w:ind w:left="714"/>
+        <w:rPr>
+          <w:rFonts w:ascii="Arial" w:hAnsi="Arial" w:cs="Arial"/>
+          <w:color w:val="000000" w:themeColor="text1"/>
+          <w:lang w:val="hu-HU"/>
+        </w:rPr>
+      </w:pPr>
     </w:p>
     <w:p>
       <w:pPr>
@@ -1585,65 +3189,72 @@
           <w:ilvl w:val="0"/>
           <w:numId w:val="1"/>
         </w:numPr>
-        <w:rPr>
-          <w:rFonts w:ascii="Arial" w:hAnsi="Arial" w:cs="Arial"/>
-          <w:color w:val="000000" w:themeColor="text1"/>
-          <w:lang w:val="hu-HU"/>
-        </w:rPr>
-      </w:pPr>
-      <w:r>
-        <w:rPr>
-          <w:rFonts w:ascii="Arial" w:hAnsi="Arial" w:cs="Arial"/>
-          <w:color w:val="000000" w:themeColor="text1"/>
-          <w:lang w:val="hu-HU"/>
-        </w:rPr>
-        <w:t xml:space="preserve">A program a </w:t>
-      </w:r>
-      <w:proofErr w:type="spellStart"/>
-      <w:proofErr w:type="gramStart"/>
-      <w:r>
-        <w:rPr>
-          <w:rFonts w:ascii="Arial" w:hAnsi="Arial" w:cs="Arial"/>
-          <w:color w:val="000000" w:themeColor="text1"/>
-          <w:lang w:val="hu-HU"/>
-        </w:rPr>
-        <w:t>Graph</w:t>
-      </w:r>
-      <w:proofErr w:type="spellEnd"/>
-      <w:r>
-        <w:rPr>
-          <w:rFonts w:ascii="Arial" w:hAnsi="Arial" w:cs="Arial"/>
-          <w:color w:val="000000" w:themeColor="text1"/>
-          <w:lang w:val="hu-HU"/>
-        </w:rPr>
-        <w:t>::</w:t>
-      </w:r>
-      <w:proofErr w:type="spellStart"/>
-      <w:r>
-        <w:rPr>
-          <w:rFonts w:ascii="Arial" w:hAnsi="Arial" w:cs="Arial"/>
-          <w:color w:val="000000" w:themeColor="text1"/>
-          <w:lang w:val="hu-HU"/>
-        </w:rPr>
-        <w:t>findPathI</w:t>
-      </w:r>
-      <w:proofErr w:type="spellEnd"/>
-      <w:r>
-        <w:rPr>
-          <w:rFonts w:ascii="Arial" w:hAnsi="Arial" w:cs="Arial"/>
-          <w:color w:val="000000" w:themeColor="text1"/>
-          <w:lang w:val="hu-HU"/>
-        </w:rPr>
-        <w:t>(</w:t>
-      </w:r>
-      <w:proofErr w:type="gramEnd"/>
-      <w:r>
-        <w:rPr>
-          <w:rFonts w:ascii="Arial" w:hAnsi="Arial" w:cs="Arial"/>
-          <w:color w:val="000000" w:themeColor="text1"/>
-          <w:lang w:val="hu-HU"/>
-        </w:rPr>
-        <w:t xml:space="preserve">) függvényben egy Dijkstra algoritmussal keresi a legrövidebb utat a megadott két pont között. </w:t>
+        <w:ind w:left="714" w:hanging="357"/>
+        <w:rPr>
+          <w:rFonts w:ascii="Arial" w:hAnsi="Arial" w:cs="Arial"/>
+          <w:b/>
+          <w:bCs/>
+          <w:color w:val="000000" w:themeColor="text1"/>
+          <w:sz w:val="28"/>
+          <w:szCs w:val="28"/>
+          <w:lang w:val="hu-HU"/>
+        </w:rPr>
+      </w:pPr>
+      <w:r>
+        <w:rPr>
+          <w:rFonts w:ascii="Arial" w:hAnsi="Arial" w:cs="Arial"/>
+          <w:b/>
+          <w:bCs/>
+          <w:color w:val="000000" w:themeColor="text1"/>
+          <w:sz w:val="28"/>
+          <w:szCs w:val="28"/>
+          <w:lang w:val="hu-HU"/>
+        </w:rPr>
+        <w:t>Windows alapú operációs rendszeren:</w:t>
+      </w:r>
+    </w:p>
+    <w:p>
+      <w:pPr>
+        <w:pStyle w:val="ListParagraph"/>
+        <w:widowControl w:val="0"/>
+        <w:ind w:left="714"/>
+        <w:rPr>
+          <w:rFonts w:ascii="Arial" w:hAnsi="Arial" w:cs="Arial"/>
+          <w:color w:val="000000" w:themeColor="text1"/>
+          <w:lang w:val="hu-HU"/>
+        </w:rPr>
+      </w:pPr>
+    </w:p>
+    <w:p>
+      <w:pPr>
+        <w:pStyle w:val="ListParagraph"/>
+        <w:widowControl w:val="0"/>
+        <w:numPr>
+          <w:ilvl w:val="0"/>
+          <w:numId w:val="1"/>
+        </w:numPr>
+        <w:ind w:left="714" w:hanging="357"/>
+        <w:rPr>
+          <w:rFonts w:ascii="Arial" w:hAnsi="Arial" w:cs="Arial"/>
+          <w:b/>
+          <w:bCs/>
+          <w:color w:val="000000" w:themeColor="text1"/>
+          <w:sz w:val="28"/>
+          <w:szCs w:val="28"/>
+          <w:lang w:val="hu-HU"/>
+        </w:rPr>
+      </w:pPr>
+      <w:r>
+        <w:rPr>
+          <w:rFonts w:ascii="Arial" w:hAnsi="Arial" w:cs="Arial"/>
+          <w:b/>
+          <w:bCs/>
+          <w:color w:val="000000" w:themeColor="text1"/>
+          <w:sz w:val="28"/>
+          <w:szCs w:val="28"/>
+          <w:lang w:val="hu-HU"/>
+        </w:rPr>
+        <w:t>Vezérlés:</w:t>
       </w:r>
     </w:p>
     <w:p>
@@ -1656,17 +3267,37 @@
         </w:numPr>
         <w:rPr>
           <w:rFonts w:ascii="Arial" w:hAnsi="Arial" w:cs="Arial"/>
-          <w:color w:val="000000" w:themeColor="text1"/>
-          <w:lang w:val="hu-HU"/>
-        </w:rPr>
-      </w:pPr>
-      <w:r>
-        <w:rPr>
-          <w:rFonts w:ascii="Arial" w:hAnsi="Arial" w:cs="Arial"/>
-          <w:color w:val="000000" w:themeColor="text1"/>
-          <w:lang w:val="hu-HU"/>
-        </w:rPr>
-        <w:t>Bemenet: két pont.</w:t>
+          <w:color w:val="C00000"/>
+          <w:lang w:val="hu-HU"/>
+        </w:rPr>
+      </w:pPr>
+      <w:r>
+        <w:rPr>
+          <w:rFonts w:ascii="Arial" w:hAnsi="Arial" w:cs="Arial"/>
+          <w:color w:val="C00000"/>
+          <w:lang w:val="hu-HU"/>
+        </w:rPr>
+        <w:t>Útvonaltervezés:</w:t>
+      </w:r>
+    </w:p>
+    <w:p>
+      <w:pPr>
+        <w:pStyle w:val="ListParagraph"/>
+        <w:widowControl w:val="0"/>
+        <w:ind w:left="1440"/>
+        <w:rPr>
+          <w:rFonts w:ascii="Arial" w:hAnsi="Arial" w:cs="Arial"/>
+          <w:color w:val="000000" w:themeColor="text1"/>
+          <w:lang w:val="hu-HU"/>
+        </w:rPr>
+      </w:pPr>
+      <w:r>
+        <w:rPr>
+          <w:rFonts w:ascii="Arial" w:hAnsi="Arial" w:cs="Arial"/>
+          <w:color w:val="000000" w:themeColor="text1"/>
+          <w:lang w:val="hu-HU"/>
+        </w:rPr>
+        <w:t>A menüben az 1-es megadásával belép a program az útvonaltervezésbe. Itt kilistázza a gráf Pontjait és utána meg kell adni a kezdőpont- majd a végpont nevét. Utána a program kiírja a legrövidebb utat és idejét. Onnan egy enter megadásával lehet visszalépni a főmenübe.</w:t>
       </w:r>
     </w:p>
     <w:p>
@@ -1686,10 +3317,96 @@
       <w:r>
         <w:rPr>
           <w:rFonts w:ascii="Arial" w:hAnsi="Arial" w:cs="Arial"/>
-          <w:color w:val="000000" w:themeColor="text1"/>
-          <w:lang w:val="hu-HU"/>
-        </w:rPr>
-        <w:t>Minden ponthoz végtelen távolságot rendelünk kivéve a kezdőponthoz, ami 0 lesz.</w:t>
+          <w:color w:val="C00000"/>
+          <w:lang w:val="hu-HU"/>
+        </w:rPr>
+        <w:t>Csomópont vagy Él felvétele:</w:t>
+      </w:r>
+      <w:r>
+        <w:rPr>
+          <w:rFonts w:ascii="Arial" w:hAnsi="Arial" w:cs="Arial"/>
+          <w:color w:val="000000" w:themeColor="text1"/>
+          <w:lang w:val="hu-HU"/>
+        </w:rPr>
+        <w:br/>
+        <w:t xml:space="preserve">A menüben a 2-es gomb megadásával lehet belépni a felvételi menüben. </w:t>
+      </w:r>
+    </w:p>
+    <w:p>
+      <w:pPr>
+        <w:pStyle w:val="ListParagraph"/>
+        <w:widowControl w:val="0"/>
+        <w:numPr>
+          <w:ilvl w:val="2"/>
+          <w:numId w:val="1"/>
+        </w:numPr>
+        <w:rPr>
+          <w:rFonts w:ascii="Arial" w:hAnsi="Arial" w:cs="Arial"/>
+          <w:color w:val="000000" w:themeColor="text1"/>
+          <w:lang w:val="hu-HU"/>
+        </w:rPr>
+      </w:pPr>
+      <w:r>
+        <w:rPr>
+          <w:rFonts w:ascii="Arial" w:hAnsi="Arial" w:cs="Arial"/>
+          <w:color w:val="000000" w:themeColor="text1"/>
+          <w:lang w:val="hu-HU"/>
+        </w:rPr>
+        <w:t>Itt a 1-es gombbal egy pontot tudsz felvenni. Meg kell adni a Pont nevét és a program magától felveszi.</w:t>
+      </w:r>
+    </w:p>
+    <w:p>
+      <w:pPr>
+        <w:pStyle w:val="ListParagraph"/>
+        <w:widowControl w:val="0"/>
+        <w:numPr>
+          <w:ilvl w:val="2"/>
+          <w:numId w:val="1"/>
+        </w:numPr>
+        <w:rPr>
+          <w:rFonts w:ascii="Arial" w:hAnsi="Arial" w:cs="Arial"/>
+          <w:color w:val="000000" w:themeColor="text1"/>
+          <w:lang w:val="hu-HU"/>
+        </w:rPr>
+      </w:pPr>
+      <w:r>
+        <w:rPr>
+          <w:rFonts w:ascii="Arial" w:hAnsi="Arial" w:cs="Arial"/>
+          <w:color w:val="000000" w:themeColor="text1"/>
+          <w:lang w:val="hu-HU"/>
+        </w:rPr>
+        <w:t xml:space="preserve">A 2-es gomb megadásával Éleket tud a felhasználó felvenni. Itt a program először kér egy nevet az élnek. Utána kilistázza a meglévő pontokat és </w:t>
+      </w:r>
+      <w:r>
+        <w:rPr>
+          <w:rFonts w:ascii="Arial" w:hAnsi="Arial" w:cs="Arial"/>
+          <w:color w:val="000000" w:themeColor="text1"/>
+          <w:lang w:val="hu-HU"/>
+        </w:rPr>
+        <w:t>Kéri az új él két végpontjának az Id-jét. Utoljára pedig az új él hosszát kell megadni méterben.</w:t>
+      </w:r>
+    </w:p>
+    <w:p>
+      <w:pPr>
+        <w:pStyle w:val="ListParagraph"/>
+        <w:widowControl w:val="0"/>
+        <w:numPr>
+          <w:ilvl w:val="2"/>
+          <w:numId w:val="1"/>
+        </w:numPr>
+        <w:rPr>
+          <w:rFonts w:ascii="Arial" w:hAnsi="Arial" w:cs="Arial"/>
+          <w:color w:val="000000" w:themeColor="text1"/>
+          <w:lang w:val="hu-HU"/>
+        </w:rPr>
+      </w:pPr>
+      <w:r>
+        <w:rPr>
+          <w:rFonts w:ascii="Arial" w:hAnsi="Arial" w:cs="Arial"/>
+          <w:color w:val="000000" w:themeColor="text1"/>
+          <w:lang w:val="hu-HU"/>
+        </w:rPr>
+        <w:t xml:space="preserve"> A 3-as gomb megadásával visszaléphet a felhasználó a menübe.</w:t>
       </w:r>
     </w:p>
     <w:p>
@@ -1709,10 +3426,19 @@
       <w:r>
         <w:rPr>
           <w:rFonts w:ascii="Arial" w:hAnsi="Arial" w:cs="Arial"/>
-          <w:color w:val="000000" w:themeColor="text1"/>
-          <w:lang w:val="hu-HU"/>
-        </w:rPr>
-        <w:t>Az összes többi pont meglátogatatlannak jelöli a program.</w:t>
+          <w:color w:val="C00000"/>
+          <w:lang w:val="hu-HU"/>
+        </w:rPr>
+        <w:t>Csomópontok listázása:</w:t>
+      </w:r>
+      <w:r>
+        <w:rPr>
+          <w:rFonts w:ascii="Arial" w:hAnsi="Arial" w:cs="Arial"/>
+          <w:color w:val="000000" w:themeColor="text1"/>
+          <w:lang w:val="hu-HU"/>
+        </w:rPr>
+        <w:br/>
+        <w:t>A menüben a 3-as gomb megadásával a program kilistázza a gráfban tárolt pontokat. Innen egy enter megadásával lehet visszalépni a menübe.</w:t>
       </w:r>
     </w:p>
     <w:p>
@@ -1732,141 +3458,24 @@
       <w:r>
         <w:rPr>
           <w:rFonts w:ascii="Arial" w:hAnsi="Arial" w:cs="Arial"/>
-          <w:color w:val="000000" w:themeColor="text1"/>
-          <w:lang w:val="hu-HU"/>
-        </w:rPr>
-        <w:t>A kezdőpontból elérhető pontok közül kiválasztja a legközelebbit.</w:t>
-      </w:r>
-    </w:p>
-    <w:p>
-      <w:pPr>
-        <w:pStyle w:val="ListParagraph"/>
-        <w:widowControl w:val="0"/>
-        <w:numPr>
-          <w:ilvl w:val="2"/>
-          <w:numId w:val="1"/>
-        </w:numPr>
-        <w:rPr>
-          <w:rFonts w:ascii="Arial" w:hAnsi="Arial" w:cs="Arial"/>
-          <w:color w:val="000000" w:themeColor="text1"/>
-          <w:lang w:val="hu-HU"/>
-        </w:rPr>
-      </w:pPr>
-      <w:r>
-        <w:rPr>
-          <w:rFonts w:ascii="Arial" w:hAnsi="Arial" w:cs="Arial"/>
-          <w:color w:val="000000" w:themeColor="text1"/>
-          <w:lang w:val="hu-HU"/>
-        </w:rPr>
-        <w:t>Megnézi az összes szomszédját milyen távol van és kiszámolja a távolságot odáig a kezdőpontból.</w:t>
-      </w:r>
-    </w:p>
-    <w:p>
-      <w:pPr>
-        <w:pStyle w:val="ListParagraph"/>
-        <w:widowControl w:val="0"/>
-        <w:numPr>
-          <w:ilvl w:val="2"/>
-          <w:numId w:val="1"/>
-        </w:numPr>
-        <w:rPr>
-          <w:rFonts w:ascii="Arial" w:hAnsi="Arial" w:cs="Arial"/>
-          <w:color w:val="000000" w:themeColor="text1"/>
-          <w:lang w:val="hu-HU"/>
-        </w:rPr>
-      </w:pPr>
-      <w:r>
-        <w:rPr>
-          <w:rFonts w:ascii="Arial" w:hAnsi="Arial" w:cs="Arial"/>
-          <w:color w:val="000000" w:themeColor="text1"/>
-          <w:lang w:val="hu-HU"/>
-        </w:rPr>
-        <w:t xml:space="preserve">Ha ez a táv kisebb, mint az eddig abba a pontba menő táv akkor átírjuk. </w:t>
-      </w:r>
-    </w:p>
-    <w:p>
-      <w:pPr>
-        <w:pStyle w:val="ListParagraph"/>
-        <w:widowControl w:val="0"/>
-        <w:numPr>
-          <w:ilvl w:val="1"/>
-          <w:numId w:val="1"/>
-        </w:numPr>
-        <w:rPr>
-          <w:rFonts w:ascii="Arial" w:hAnsi="Arial" w:cs="Arial"/>
-          <w:color w:val="000000" w:themeColor="text1"/>
-          <w:lang w:val="hu-HU"/>
-        </w:rPr>
-      </w:pPr>
-      <w:r>
-        <w:rPr>
-          <w:rFonts w:ascii="Arial" w:hAnsi="Arial" w:cs="Arial"/>
-          <w:color w:val="000000" w:themeColor="text1"/>
-          <w:lang w:val="hu-HU"/>
-        </w:rPr>
-        <w:t>Megjelöljük az előbb vizsgált pontot (amiből jött a következő) meglátogatottnak</w:t>
-      </w:r>
-    </w:p>
-    <w:p>
-      <w:pPr>
-        <w:pStyle w:val="ListParagraph"/>
-        <w:widowControl w:val="0"/>
-        <w:numPr>
-          <w:ilvl w:val="1"/>
-          <w:numId w:val="1"/>
-        </w:numPr>
-        <w:rPr>
-          <w:rFonts w:ascii="Arial" w:hAnsi="Arial" w:cs="Arial"/>
-          <w:color w:val="000000" w:themeColor="text1"/>
-          <w:lang w:val="hu-HU"/>
-        </w:rPr>
-      </w:pPr>
-      <w:r>
-        <w:rPr>
-          <w:rFonts w:ascii="Arial" w:hAnsi="Arial" w:cs="Arial"/>
-          <w:color w:val="000000" w:themeColor="text1"/>
-          <w:lang w:val="hu-HU"/>
-        </w:rPr>
-        <w:t>Ezt addig ismételjük amíg el nem érjük a célpontot vagy el nem fogynak a meglátogatható pontok</w:t>
-      </w:r>
-    </w:p>
-    <w:p>
-      <w:pPr>
-        <w:pStyle w:val="ListParagraph"/>
-        <w:widowControl w:val="0"/>
-        <w:numPr>
-          <w:ilvl w:val="1"/>
-          <w:numId w:val="1"/>
-        </w:numPr>
-        <w:rPr>
-          <w:rFonts w:ascii="Arial" w:hAnsi="Arial" w:cs="Arial"/>
-          <w:color w:val="000000" w:themeColor="text1"/>
-          <w:lang w:val="hu-HU"/>
-        </w:rPr>
-      </w:pPr>
-      <w:r>
-        <w:rPr>
-          <w:rFonts w:ascii="Arial" w:hAnsi="Arial" w:cs="Arial"/>
-          <w:color w:val="000000" w:themeColor="text1"/>
-          <w:lang w:val="hu-HU"/>
-        </w:rPr>
-        <w:t>Kimenet: Tömb a pontokból, amin végig kell menni.</w:t>
-      </w:r>
-    </w:p>
-    <w:p>
-      <w:pPr>
-        <w:widowControl w:val="0"/>
-        <w:ind w:left="1080"/>
-        <w:rPr>
-          <w:rFonts w:ascii="Arial" w:hAnsi="Arial" w:cs="Arial"/>
-          <w:color w:val="000000" w:themeColor="text1"/>
-          <w:lang w:val="hu-HU"/>
-        </w:rPr>
-      </w:pPr>
+          <w:color w:val="C00000"/>
+          <w:lang w:val="hu-HU"/>
+        </w:rPr>
+        <w:t>Kilépés:</w:t>
+      </w:r>
+      <w:r>
+        <w:rPr>
+          <w:rFonts w:ascii="Arial" w:hAnsi="Arial" w:cs="Arial"/>
+          <w:color w:val="000000" w:themeColor="text1"/>
+          <w:lang w:val="hu-HU"/>
+        </w:rPr>
+        <w:br/>
+        <w:t>A menüben a 4-es gomb megnyomásával, a program elkezdi a kilépést. Elmenti a változtatásokat a gráf-ból.</w:t>
+      </w:r>
     </w:p>
     <w:sectPr>
-      <w:footerReference w:type="even" r:id="rId10"/>
-      <w:footerReference w:type="default" r:id="rId11"/>
+      <w:footerReference w:type="even" r:id="rId11"/>
+      <w:footerReference w:type="default" r:id="rId12"/>
       <w:pgSz w:w="11906" w:h="16838"/>
       <w:pgMar w:top="1440" w:right="1440" w:bottom="1440" w:left="1440" w:header="708" w:footer="708" w:gutter="0"/>
       <w:cols w:space="708"/>
@@ -2090,7 +3699,7 @@
         <w:rFonts w:ascii="Wingdings" w:hAnsi="Wingdings" w:hint="default"/>
       </w:rPr>
     </w:lvl>
-    <w:lvl w:ilvl="3" w:tplc="08090001" w:tentative="1">
+    <w:lvl w:ilvl="3" w:tplc="08090001">
       <w:start w:val="1"/>
       <w:numFmt w:val="bullet"/>
       <w:lvlText w:val=""/>

</xml_diff>